<commit_message>
update to promts and software requirments documents.
</commit_message>
<xml_diff>
--- a/documents/archived/Week13-AI-Logs.docx
+++ b/documents/archived/Week13-AI-Logs.docx
@@ -28,15 +28,15 @@
         <w:tblLook w:val="04A0" w:firstRow="1" w:lastRow="0" w:firstColumn="1" w:lastColumn="0" w:noHBand="0" w:noVBand="1"/>
       </w:tblPr>
       <w:tblGrid>
-        <w:gridCol w:w="2236"/>
-        <w:gridCol w:w="999"/>
-        <w:gridCol w:w="2790"/>
-        <w:gridCol w:w="3325"/>
+        <w:gridCol w:w="2169"/>
+        <w:gridCol w:w="982"/>
+        <w:gridCol w:w="2949"/>
+        <w:gridCol w:w="3250"/>
       </w:tblGrid>
       <w:tr>
         <w:tc>
           <w:tcPr>
-            <w:tcW w:w="2236" w:type="dxa"/>
+            <w:tcW w:w="2169" w:type="dxa"/>
           </w:tcPr>
           <w:p>
             <w:pPr>
@@ -59,7 +59,7 @@
         </w:tc>
         <w:tc>
           <w:tcPr>
-            <w:tcW w:w="999" w:type="dxa"/>
+            <w:tcW w:w="982" w:type="dxa"/>
           </w:tcPr>
           <w:p>
             <w:pPr>
@@ -82,7 +82,7 @@
         </w:tc>
         <w:tc>
           <w:tcPr>
-            <w:tcW w:w="2790" w:type="dxa"/>
+            <w:tcW w:w="2949" w:type="dxa"/>
           </w:tcPr>
           <w:p>
             <w:pPr>
@@ -105,7 +105,7 @@
         </w:tc>
         <w:tc>
           <w:tcPr>
-            <w:tcW w:w="3325" w:type="dxa"/>
+            <w:tcW w:w="3250" w:type="dxa"/>
           </w:tcPr>
           <w:p>
             <w:pPr>
@@ -130,7 +130,7 @@
       <w:tr>
         <w:tc>
           <w:tcPr>
-            <w:tcW w:w="2236" w:type="dxa"/>
+            <w:tcW w:w="2169" w:type="dxa"/>
           </w:tcPr>
           <w:p>
             <w:pPr>
@@ -153,7 +153,7 @@
         </w:tc>
         <w:tc>
           <w:tcPr>
-            <w:tcW w:w="999" w:type="dxa"/>
+            <w:tcW w:w="982" w:type="dxa"/>
           </w:tcPr>
           <w:p>
             <w:pPr>
@@ -176,7 +176,7 @@
         </w:tc>
         <w:tc>
           <w:tcPr>
-            <w:tcW w:w="2790" w:type="dxa"/>
+            <w:tcW w:w="2949" w:type="dxa"/>
           </w:tcPr>
           <w:p>
             <w:pPr>
@@ -199,7 +199,7 @@
         </w:tc>
         <w:tc>
           <w:tcPr>
-            <w:tcW w:w="3325" w:type="dxa"/>
+            <w:tcW w:w="3250" w:type="dxa"/>
           </w:tcPr>
           <w:p>
             <w:pPr>
@@ -224,7 +224,7 @@
       <w:tr>
         <w:tc>
           <w:tcPr>
-            <w:tcW w:w="2236" w:type="dxa"/>
+            <w:tcW w:w="2169" w:type="dxa"/>
           </w:tcPr>
           <w:p>
             <w:pPr>
@@ -247,7 +247,7 @@
         </w:tc>
         <w:tc>
           <w:tcPr>
-            <w:tcW w:w="999" w:type="dxa"/>
+            <w:tcW w:w="982" w:type="dxa"/>
           </w:tcPr>
           <w:p>
             <w:pPr>
@@ -270,7 +270,7 @@
         </w:tc>
         <w:tc>
           <w:tcPr>
-            <w:tcW w:w="2790" w:type="dxa"/>
+            <w:tcW w:w="2949" w:type="dxa"/>
           </w:tcPr>
           <w:p>
             <w:pPr>
@@ -293,7 +293,7 @@
         </w:tc>
         <w:tc>
           <w:tcPr>
-            <w:tcW w:w="3325" w:type="dxa"/>
+            <w:tcW w:w="3250" w:type="dxa"/>
           </w:tcPr>
           <w:p>
             <w:pPr>
@@ -318,7 +318,7 @@
       <w:tr>
         <w:tc>
           <w:tcPr>
-            <w:tcW w:w="2236" w:type="dxa"/>
+            <w:tcW w:w="2169" w:type="dxa"/>
           </w:tcPr>
           <w:p>
             <w:pPr>
@@ -341,7 +341,7 @@
         </w:tc>
         <w:tc>
           <w:tcPr>
-            <w:tcW w:w="999" w:type="dxa"/>
+            <w:tcW w:w="982" w:type="dxa"/>
           </w:tcPr>
           <w:p>
             <w:pPr>
@@ -364,7 +364,7 @@
         </w:tc>
         <w:tc>
           <w:tcPr>
-            <w:tcW w:w="2790" w:type="dxa"/>
+            <w:tcW w:w="2949" w:type="dxa"/>
           </w:tcPr>
           <w:p>
             <w:pPr>
@@ -387,7 +387,7 @@
         </w:tc>
         <w:tc>
           <w:tcPr>
-            <w:tcW w:w="3325" w:type="dxa"/>
+            <w:tcW w:w="3250" w:type="dxa"/>
           </w:tcPr>
           <w:p>
             <w:pPr>
@@ -428,7 +428,7 @@
       <w:tr>
         <w:tc>
           <w:tcPr>
-            <w:tcW w:w="2236" w:type="dxa"/>
+            <w:tcW w:w="2169" w:type="dxa"/>
           </w:tcPr>
           <w:p>
             <w:pPr>
@@ -451,7 +451,7 @@
         </w:tc>
         <w:tc>
           <w:tcPr>
-            <w:tcW w:w="999" w:type="dxa"/>
+            <w:tcW w:w="982" w:type="dxa"/>
           </w:tcPr>
           <w:p>
             <w:pPr>
@@ -474,7 +474,7 @@
         </w:tc>
         <w:tc>
           <w:tcPr>
-            <w:tcW w:w="2790" w:type="dxa"/>
+            <w:tcW w:w="2949" w:type="dxa"/>
           </w:tcPr>
           <w:p>
             <w:pPr>
@@ -497,7 +497,7 @@
         </w:tc>
         <w:tc>
           <w:tcPr>
-            <w:tcW w:w="3325" w:type="dxa"/>
+            <w:tcW w:w="3250" w:type="dxa"/>
           </w:tcPr>
           <w:p>
             <w:pPr>
@@ -522,7 +522,7 @@
       <w:tr>
         <w:tc>
           <w:tcPr>
-            <w:tcW w:w="2236" w:type="dxa"/>
+            <w:tcW w:w="2169" w:type="dxa"/>
           </w:tcPr>
           <w:p>
             <w:pPr>
@@ -545,7 +545,7 @@
         </w:tc>
         <w:tc>
           <w:tcPr>
-            <w:tcW w:w="999" w:type="dxa"/>
+            <w:tcW w:w="982" w:type="dxa"/>
           </w:tcPr>
           <w:p>
             <w:pPr>
@@ -568,7 +568,7 @@
         </w:tc>
         <w:tc>
           <w:tcPr>
-            <w:tcW w:w="2790" w:type="dxa"/>
+            <w:tcW w:w="2949" w:type="dxa"/>
           </w:tcPr>
           <w:p>
             <w:pPr>
@@ -591,7 +591,7 @@
         </w:tc>
         <w:tc>
           <w:tcPr>
-            <w:tcW w:w="3325" w:type="dxa"/>
+            <w:tcW w:w="3250" w:type="dxa"/>
           </w:tcPr>
           <w:p>
             <w:pPr>
@@ -642,7 +642,7 @@
       <w:tr>
         <w:tc>
           <w:tcPr>
-            <w:tcW w:w="2236" w:type="dxa"/>
+            <w:tcW w:w="2169" w:type="dxa"/>
           </w:tcPr>
           <w:p>
             <w:pPr>
@@ -665,7 +665,7 @@
         </w:tc>
         <w:tc>
           <w:tcPr>
-            <w:tcW w:w="999" w:type="dxa"/>
+            <w:tcW w:w="982" w:type="dxa"/>
           </w:tcPr>
           <w:p>
             <w:pPr>
@@ -688,7 +688,7 @@
         </w:tc>
         <w:tc>
           <w:tcPr>
-            <w:tcW w:w="2790" w:type="dxa"/>
+            <w:tcW w:w="2949" w:type="dxa"/>
           </w:tcPr>
           <w:p>
             <w:pPr>
@@ -720,7 +720,7 @@
         </w:tc>
         <w:tc>
           <w:tcPr>
-            <w:tcW w:w="3325" w:type="dxa"/>
+            <w:tcW w:w="3250" w:type="dxa"/>
           </w:tcPr>
           <w:p>
             <w:pPr>
@@ -746,7 +746,7 @@
       <w:tr>
         <w:tc>
           <w:tcPr>
-            <w:tcW w:w="2236" w:type="dxa"/>
+            <w:tcW w:w="2169" w:type="dxa"/>
           </w:tcPr>
           <w:p>
             <w:pPr>
@@ -769,7 +769,7 @@
         </w:tc>
         <w:tc>
           <w:tcPr>
-            <w:tcW w:w="999" w:type="dxa"/>
+            <w:tcW w:w="982" w:type="dxa"/>
           </w:tcPr>
           <w:p>
             <w:pPr>
@@ -792,7 +792,7 @@
         </w:tc>
         <w:tc>
           <w:tcPr>
-            <w:tcW w:w="2790" w:type="dxa"/>
+            <w:tcW w:w="2949" w:type="dxa"/>
           </w:tcPr>
           <w:p>
             <w:pPr>
@@ -815,7 +815,7 @@
         </w:tc>
         <w:tc>
           <w:tcPr>
-            <w:tcW w:w="3325" w:type="dxa"/>
+            <w:tcW w:w="3250" w:type="dxa"/>
           </w:tcPr>
           <w:p>
             <w:pPr>
@@ -848,7 +848,7 @@
       <w:tr>
         <w:tc>
           <w:tcPr>
-            <w:tcW w:w="2236" w:type="dxa"/>
+            <w:tcW w:w="2169" w:type="dxa"/>
           </w:tcPr>
           <w:p>
             <w:pPr>
@@ -871,7 +871,7 @@
         </w:tc>
         <w:tc>
           <w:tcPr>
-            <w:tcW w:w="999" w:type="dxa"/>
+            <w:tcW w:w="982" w:type="dxa"/>
           </w:tcPr>
           <w:p>
             <w:pPr>
@@ -894,7 +894,7 @@
         </w:tc>
         <w:tc>
           <w:tcPr>
-            <w:tcW w:w="2790" w:type="dxa"/>
+            <w:tcW w:w="2949" w:type="dxa"/>
           </w:tcPr>
           <w:p>
             <w:pPr>
@@ -917,7 +917,7 @@
         </w:tc>
         <w:tc>
           <w:tcPr>
-            <w:tcW w:w="3325" w:type="dxa"/>
+            <w:tcW w:w="3250" w:type="dxa"/>
           </w:tcPr>
           <w:p>
             <w:pPr>
@@ -942,7 +942,7 @@
       <w:tr>
         <w:tc>
           <w:tcPr>
-            <w:tcW w:w="2236" w:type="dxa"/>
+            <w:tcW w:w="2169" w:type="dxa"/>
           </w:tcPr>
           <w:p>
             <w:pPr>
@@ -965,7 +965,7 @@
         </w:tc>
         <w:tc>
           <w:tcPr>
-            <w:tcW w:w="999" w:type="dxa"/>
+            <w:tcW w:w="982" w:type="dxa"/>
           </w:tcPr>
           <w:p>
             <w:pPr>
@@ -988,7 +988,7 @@
         </w:tc>
         <w:tc>
           <w:tcPr>
-            <w:tcW w:w="2790" w:type="dxa"/>
+            <w:tcW w:w="2949" w:type="dxa"/>
           </w:tcPr>
           <w:p>
             <w:pPr>
@@ -1011,7 +1011,7 @@
         </w:tc>
         <w:tc>
           <w:tcPr>
-            <w:tcW w:w="3325" w:type="dxa"/>
+            <w:tcW w:w="3250" w:type="dxa"/>
           </w:tcPr>
           <w:p>
             <w:pPr>
@@ -1036,78 +1036,937 @@
       <w:tr>
         <w:tc>
           <w:tcPr>
-            <w:tcW w:w="2236" w:type="dxa"/>
-          </w:tcPr>
-          <w:p>
-            <w:pPr>
-              <w:spacing w:line="480" w:lineRule="auto"/>
-              <w:rPr>
-                <w:rFonts w:cs="Times New Roman"/>
-                <w:bCs/>
-                <w:szCs w:val="24"/>
-              </w:rPr>
-            </w:pPr>
-            <w:r>
-              <w:rPr>
-                <w:rFonts w:cs="Times New Roman"/>
-                <w:bCs/>
-                <w:szCs w:val="24"/>
-              </w:rPr>
-              <w:t>Gemini</w:t>
-            </w:r>
-          </w:p>
-        </w:tc>
-        <w:tc>
-          <w:tcPr>
-            <w:tcW w:w="999" w:type="dxa"/>
-          </w:tcPr>
-          <w:p>
-            <w:pPr>
-              <w:spacing w:line="480" w:lineRule="auto"/>
-              <w:rPr>
-                <w:rFonts w:cs="Times New Roman"/>
-                <w:bCs/>
-                <w:szCs w:val="24"/>
-              </w:rPr>
-            </w:pPr>
-            <w:r>
-              <w:rPr>
-                <w:rFonts w:cs="Times New Roman"/>
-                <w:bCs/>
-                <w:szCs w:val="24"/>
-              </w:rPr>
-              <w:t>8/3</w:t>
-            </w:r>
-          </w:p>
-        </w:tc>
-        <w:tc>
-          <w:tcPr>
-            <w:tcW w:w="2790" w:type="dxa"/>
-          </w:tcPr>
-          <w:p>
-            <w:pPr>
-              <w:spacing w:line="480" w:lineRule="auto"/>
-              <w:rPr>
-                <w:rFonts w:cs="Times New Roman"/>
-                <w:bCs/>
-                <w:szCs w:val="24"/>
-              </w:rPr>
-            </w:pPr>
-          </w:p>
-        </w:tc>
-        <w:tc>
-          <w:tcPr>
-            <w:tcW w:w="3325" w:type="dxa"/>
-          </w:tcPr>
-          <w:p>
-            <w:pPr>
-              <w:spacing w:line="480" w:lineRule="auto"/>
-              <w:rPr>
-                <w:rFonts w:cs="Times New Roman"/>
-                <w:bCs/>
-                <w:szCs w:val="24"/>
-              </w:rPr>
-            </w:pPr>
+            <w:tcW w:w="2169" w:type="dxa"/>
+          </w:tcPr>
+          <w:p>
+            <w:pPr>
+              <w:spacing w:line="480" w:lineRule="auto"/>
+              <w:rPr>
+                <w:rFonts w:cs="Times New Roman"/>
+                <w:bCs/>
+                <w:szCs w:val="24"/>
+              </w:rPr>
+            </w:pPr>
+            <w:r>
+              <w:rPr>
+                <w:rFonts w:cs="Times New Roman"/>
+                <w:bCs/>
+                <w:szCs w:val="24"/>
+              </w:rPr>
+              <w:t>Copilot</w:t>
+            </w:r>
+          </w:p>
+        </w:tc>
+        <w:tc>
+          <w:tcPr>
+            <w:tcW w:w="982" w:type="dxa"/>
+          </w:tcPr>
+          <w:p>
+            <w:pPr>
+              <w:spacing w:line="480" w:lineRule="auto"/>
+              <w:rPr>
+                <w:rFonts w:cs="Times New Roman"/>
+                <w:bCs/>
+                <w:szCs w:val="24"/>
+              </w:rPr>
+            </w:pPr>
+            <w:r>
+              <w:rPr>
+                <w:rFonts w:cs="Times New Roman"/>
+                <w:bCs/>
+                <w:szCs w:val="24"/>
+              </w:rPr>
+              <w:t>8/</w:t>
+            </w:r>
+            <w:r>
+              <w:rPr>
+                <w:rFonts w:cs="Times New Roman"/>
+                <w:bCs/>
+                <w:szCs w:val="24"/>
+              </w:rPr>
+              <w:t>5</w:t>
+            </w:r>
+          </w:p>
+        </w:tc>
+        <w:tc>
+          <w:tcPr>
+            <w:tcW w:w="2949" w:type="dxa"/>
+          </w:tcPr>
+          <w:p>
+            <w:pPr>
+              <w:spacing w:line="480" w:lineRule="auto"/>
+              <w:rPr>
+                <w:rFonts w:cs="Times New Roman"/>
+                <w:bCs/>
+                <w:szCs w:val="24"/>
+              </w:rPr>
+            </w:pPr>
+            <w:r>
+              <w:rPr>
+                <w:rFonts w:cs="Times New Roman"/>
+                <w:bCs/>
+                <w:szCs w:val="24"/>
+              </w:rPr>
+              <w:t xml:space="preserve">Read #codebase and produce a ci.yml in the folder .github/workflows to run and verify the class-level testers in /classes folder. </w:t>
+            </w:r>
+            <w:r>
+              <w:rPr>
+                <w:rFonts w:cs="Times New Roman"/>
+                <w:bCs/>
+                <w:szCs w:val="24"/>
+              </w:rPr>
+              <w:br/>
+            </w:r>
+            <w:r>
+              <w:rPr>
+                <w:rFonts w:cs="Times New Roman"/>
+                <w:bCs/>
+                <w:szCs w:val="24"/>
+              </w:rPr>
+              <w:br/>
+              <w:t xml:space="preserve">Do not change or produce any code or folders outside of the .github/workflows folder. Do not make up tests </w:t>
+            </w:r>
+            <w:r>
+              <w:rPr>
+                <w:rFonts w:cs="Times New Roman"/>
+                <w:bCs/>
+                <w:szCs w:val="24"/>
+              </w:rPr>
+              <w:lastRenderedPageBreak/>
+              <w:t>that are not based on the class-level testers. </w:t>
+            </w:r>
+          </w:p>
+          <w:p>
+            <w:pPr>
+              <w:spacing w:line="480" w:lineRule="auto"/>
+              <w:rPr>
+                <w:rFonts w:cs="Times New Roman"/>
+                <w:bCs/>
+                <w:szCs w:val="24"/>
+              </w:rPr>
+            </w:pPr>
+          </w:p>
+          <w:p>
+            <w:pPr>
+              <w:spacing w:line="480" w:lineRule="auto"/>
+              <w:rPr>
+                <w:rFonts w:cs="Times New Roman"/>
+                <w:bCs/>
+                <w:szCs w:val="24"/>
+              </w:rPr>
+            </w:pPr>
+            <w:r>
+              <w:rPr>
+                <w:rFonts w:cs="Times New Roman"/>
+                <w:bCs/>
+                <w:szCs w:val="24"/>
+              </w:rPr>
+              <w:t>Make sure that ci.yml also covers criteria set in documents/</w:t>
+            </w:r>
+            <w:hyperlink r:id="rId6" w:history="1">
+              <w:r>
+                <w:rPr>
+                  <w:rStyle w:val="Hyperlink"/>
+                  <w:rFonts w:cs="Times New Roman"/>
+                  <w:bCs/>
+                  <w:szCs w:val="24"/>
+                </w:rPr>
+                <w:t>PRD.md</w:t>
+              </w:r>
+            </w:hyperlink>
+            <w:r>
+              <w:rPr>
+                <w:rFonts w:cs="Times New Roman"/>
+                <w:bCs/>
+                <w:szCs w:val="24"/>
+              </w:rPr>
+              <w:t>, documents/</w:t>
+            </w:r>
+            <w:hyperlink r:id="rId7" w:history="1">
+              <w:r>
+                <w:rPr>
+                  <w:rStyle w:val="Hyperlink"/>
+                  <w:rFonts w:cs="Times New Roman"/>
+                  <w:bCs/>
+                  <w:szCs w:val="24"/>
+                </w:rPr>
+                <w:t>Software-Test-Plan-and-Report.md</w:t>
+              </w:r>
+            </w:hyperlink>
+            <w:r>
+              <w:rPr>
+                <w:rFonts w:cs="Times New Roman"/>
+                <w:bCs/>
+                <w:szCs w:val="24"/>
+              </w:rPr>
+              <w:t>, and README.md are covered. </w:t>
+            </w:r>
+          </w:p>
+          <w:p>
+            <w:pPr>
+              <w:spacing w:line="480" w:lineRule="auto"/>
+              <w:rPr>
+                <w:rFonts w:cs="Times New Roman"/>
+                <w:bCs/>
+                <w:szCs w:val="24"/>
+              </w:rPr>
+            </w:pPr>
+          </w:p>
+          <w:p>
+            <w:pPr>
+              <w:spacing w:line="480" w:lineRule="auto"/>
+              <w:rPr>
+                <w:rFonts w:cs="Times New Roman"/>
+                <w:bCs/>
+                <w:szCs w:val="24"/>
+              </w:rPr>
+            </w:pPr>
+            <w:r>
+              <w:rPr>
+                <w:rFonts w:cs="Times New Roman"/>
+                <w:bCs/>
+                <w:szCs w:val="24"/>
+              </w:rPr>
+              <w:t>Run the ci.yml file to ensure that the tests are working correctly</w:t>
+            </w:r>
+          </w:p>
+          <w:p>
+            <w:pPr>
+              <w:spacing w:line="480" w:lineRule="auto"/>
+              <w:rPr>
+                <w:rFonts w:cs="Times New Roman"/>
+                <w:bCs/>
+                <w:szCs w:val="24"/>
+              </w:rPr>
+            </w:pPr>
+          </w:p>
+        </w:tc>
+        <w:tc>
+          <w:tcPr>
+            <w:tcW w:w="3250" w:type="dxa"/>
+          </w:tcPr>
+          <w:p>
+            <w:pPr>
+              <w:spacing w:line="480" w:lineRule="auto"/>
+              <w:rPr>
+                <w:rFonts w:cs="Times New Roman"/>
+                <w:bCs/>
+                <w:szCs w:val="24"/>
+              </w:rPr>
+            </w:pPr>
+            <w:r>
+              <w:rPr>
+                <w:rFonts w:cs="Times New Roman"/>
+                <w:bCs/>
+                <w:szCs w:val="24"/>
+              </w:rPr>
+              <w:lastRenderedPageBreak/>
+              <w:t>This was used to generate a ci.yml file as I was missing one in my repository.</w:t>
+            </w:r>
+          </w:p>
+        </w:tc>
+      </w:tr>
+      <w:tr>
+        <w:tc>
+          <w:tcPr>
+            <w:tcW w:w="2169" w:type="dxa"/>
+          </w:tcPr>
+          <w:p>
+            <w:pPr>
+              <w:spacing w:line="480" w:lineRule="auto"/>
+              <w:rPr>
+                <w:rFonts w:cs="Times New Roman"/>
+                <w:bCs/>
+                <w:szCs w:val="24"/>
+              </w:rPr>
+            </w:pPr>
+            <w:r>
+              <w:rPr>
+                <w:rFonts w:cs="Times New Roman"/>
+                <w:bCs/>
+                <w:szCs w:val="24"/>
+              </w:rPr>
+              <w:t>Copilot</w:t>
+            </w:r>
+          </w:p>
+        </w:tc>
+        <w:tc>
+          <w:tcPr>
+            <w:tcW w:w="982" w:type="dxa"/>
+          </w:tcPr>
+          <w:p>
+            <w:pPr>
+              <w:spacing w:line="480" w:lineRule="auto"/>
+              <w:rPr>
+                <w:rFonts w:cs="Times New Roman"/>
+                <w:bCs/>
+                <w:szCs w:val="24"/>
+              </w:rPr>
+            </w:pPr>
+            <w:r>
+              <w:rPr>
+                <w:rFonts w:cs="Times New Roman"/>
+                <w:bCs/>
+                <w:szCs w:val="24"/>
+              </w:rPr>
+              <w:t>8/5</w:t>
+            </w:r>
+          </w:p>
+        </w:tc>
+        <w:tc>
+          <w:tcPr>
+            <w:tcW w:w="2949" w:type="dxa"/>
+          </w:tcPr>
+          <w:p>
+            <w:pPr>
+              <w:spacing w:line="480" w:lineRule="auto"/>
+              <w:rPr>
+                <w:rFonts w:cs="Times New Roman"/>
+                <w:bCs/>
+                <w:szCs w:val="24"/>
+              </w:rPr>
+            </w:pPr>
+            <w:r>
+              <w:rPr>
+                <w:rFonts w:cs="Times New Roman"/>
+                <w:bCs/>
+                <w:szCs w:val="24"/>
+              </w:rPr>
+              <w:t>github/prompts/generate-CM-report.md</w:t>
+            </w:r>
+          </w:p>
+          <w:p>
+            <w:pPr>
+              <w:spacing w:line="480" w:lineRule="auto"/>
+              <w:rPr>
+                <w:rFonts w:cs="Times New Roman"/>
+                <w:bCs/>
+                <w:szCs w:val="24"/>
+              </w:rPr>
+            </w:pPr>
+            <w:r>
+              <w:rPr>
+                <w:rFonts w:cs="Times New Roman"/>
+                <w:bCs/>
+                <w:szCs w:val="24"/>
+              </w:rPr>
+              <w:t>Analyze the complete repository using #codebase. Create or update</w:t>
+            </w:r>
+            <w:r>
+              <w:rPr>
+                <w:rFonts w:cs="Times New Roman"/>
+                <w:bCs/>
+                <w:szCs w:val="24"/>
+              </w:rPr>
+              <w:br/>
+              <w:t>/documents/CM_report.md. Base the document on evidence</w:t>
+            </w:r>
+            <w:r>
+              <w:rPr>
+                <w:rFonts w:cs="Times New Roman"/>
+                <w:bCs/>
+                <w:szCs w:val="24"/>
+              </w:rPr>
+              <w:br/>
+              <w:t xml:space="preserve">from the repository. Do not </w:t>
+            </w:r>
+            <w:r>
+              <w:rPr>
+                <w:rFonts w:cs="Times New Roman"/>
+                <w:bCs/>
+                <w:szCs w:val="24"/>
+              </w:rPr>
+              <w:lastRenderedPageBreak/>
+              <w:t>invent features, requirements, test results,</w:t>
+            </w:r>
+            <w:r>
+              <w:rPr>
+                <w:rFonts w:cs="Times New Roman"/>
+                <w:bCs/>
+                <w:szCs w:val="24"/>
+              </w:rPr>
+              <w:br/>
+              <w:t>risks, tools, or implementation details. Mark unsupported information</w:t>
+            </w:r>
+            <w:r>
+              <w:rPr>
+                <w:rFonts w:cs="Times New Roman"/>
+                <w:bCs/>
+                <w:szCs w:val="24"/>
+              </w:rPr>
+              <w:br/>
+              <w:t>as To Be Completed.</w:t>
+            </w:r>
+          </w:p>
+          <w:p>
+            <w:pPr>
+              <w:spacing w:line="480" w:lineRule="auto"/>
+              <w:rPr>
+                <w:rFonts w:cs="Times New Roman"/>
+                <w:bCs/>
+                <w:szCs w:val="24"/>
+              </w:rPr>
+            </w:pPr>
+          </w:p>
+        </w:tc>
+        <w:tc>
+          <w:tcPr>
+            <w:tcW w:w="3250" w:type="dxa"/>
+          </w:tcPr>
+          <w:p>
+            <w:pPr>
+              <w:spacing w:line="480" w:lineRule="auto"/>
+              <w:rPr>
+                <w:rFonts w:cs="Times New Roman"/>
+                <w:bCs/>
+                <w:szCs w:val="24"/>
+              </w:rPr>
+            </w:pPr>
+            <w:r>
+              <w:rPr>
+                <w:rFonts w:cs="Times New Roman"/>
+                <w:bCs/>
+                <w:szCs w:val="24"/>
+              </w:rPr>
+              <w:lastRenderedPageBreak/>
+              <w:t>This was used to generate a content management report for the repository.</w:t>
+            </w:r>
+          </w:p>
+        </w:tc>
+      </w:tr>
+      <w:tr>
+        <w:tc>
+          <w:tcPr>
+            <w:tcW w:w="2169" w:type="dxa"/>
+          </w:tcPr>
+          <w:p>
+            <w:pPr>
+              <w:spacing w:line="480" w:lineRule="auto"/>
+              <w:rPr>
+                <w:rFonts w:cs="Times New Roman"/>
+                <w:bCs/>
+                <w:szCs w:val="24"/>
+              </w:rPr>
+            </w:pPr>
+            <w:r>
+              <w:rPr>
+                <w:rFonts w:cs="Times New Roman"/>
+                <w:bCs/>
+                <w:szCs w:val="24"/>
+              </w:rPr>
+              <w:t>Copilot</w:t>
+            </w:r>
+          </w:p>
+        </w:tc>
+        <w:tc>
+          <w:tcPr>
+            <w:tcW w:w="982" w:type="dxa"/>
+          </w:tcPr>
+          <w:p>
+            <w:pPr>
+              <w:spacing w:line="480" w:lineRule="auto"/>
+              <w:rPr>
+                <w:rFonts w:cs="Times New Roman"/>
+                <w:bCs/>
+                <w:szCs w:val="24"/>
+              </w:rPr>
+            </w:pPr>
+            <w:r>
+              <w:rPr>
+                <w:rFonts w:cs="Times New Roman"/>
+                <w:bCs/>
+                <w:szCs w:val="24"/>
+              </w:rPr>
+              <w:t>8/5</w:t>
+            </w:r>
+          </w:p>
+        </w:tc>
+        <w:tc>
+          <w:tcPr>
+            <w:tcW w:w="2949" w:type="dxa"/>
+          </w:tcPr>
+          <w:p>
+            <w:pPr>
+              <w:spacing w:line="480" w:lineRule="auto"/>
+              <w:rPr>
+                <w:rFonts w:cs="Times New Roman"/>
+                <w:bCs/>
+                <w:szCs w:val="24"/>
+              </w:rPr>
+            </w:pPr>
+            <w:r>
+              <w:rPr>
+                <w:rFonts w:cs="Times New Roman"/>
+                <w:bCs/>
+                <w:szCs w:val="24"/>
+              </w:rPr>
+              <w:t>generate-prd</w:t>
+            </w:r>
+          </w:p>
+          <w:p>
+            <w:pPr>
+              <w:spacing w:line="480" w:lineRule="auto"/>
+              <w:rPr>
+                <w:rFonts w:cs="Times New Roman"/>
+                <w:bCs/>
+                <w:szCs w:val="24"/>
+              </w:rPr>
+            </w:pPr>
+            <w:r>
+              <w:rPr>
+                <w:rFonts w:cs="Times New Roman"/>
+                <w:bCs/>
+                <w:szCs w:val="24"/>
+              </w:rPr>
+              <w:t>Analyze the complete repository using #codebase. Create or update</w:t>
+            </w:r>
+          </w:p>
+          <w:p>
+            <w:pPr>
+              <w:spacing w:line="480" w:lineRule="auto"/>
+              <w:rPr>
+                <w:rFonts w:cs="Times New Roman"/>
+                <w:bCs/>
+                <w:szCs w:val="24"/>
+              </w:rPr>
+            </w:pPr>
+            <w:r>
+              <w:rPr>
+                <w:rFonts w:cs="Times New Roman"/>
+                <w:bCs/>
+                <w:szCs w:val="24"/>
+              </w:rPr>
+              <w:t>/documents/PRD.md. Base the document on evidence</w:t>
+            </w:r>
+          </w:p>
+          <w:p>
+            <w:pPr>
+              <w:spacing w:line="480" w:lineRule="auto"/>
+              <w:rPr>
+                <w:rFonts w:cs="Times New Roman"/>
+                <w:bCs/>
+                <w:szCs w:val="24"/>
+              </w:rPr>
+            </w:pPr>
+            <w:r>
+              <w:rPr>
+                <w:rFonts w:cs="Times New Roman"/>
+                <w:bCs/>
+                <w:szCs w:val="24"/>
+              </w:rPr>
+              <w:t>from the repository. Do not invent features, requirements, test results,</w:t>
+            </w:r>
+          </w:p>
+          <w:p>
+            <w:pPr>
+              <w:spacing w:line="480" w:lineRule="auto"/>
+              <w:rPr>
+                <w:rFonts w:cs="Times New Roman"/>
+                <w:bCs/>
+                <w:szCs w:val="24"/>
+              </w:rPr>
+            </w:pPr>
+            <w:r>
+              <w:rPr>
+                <w:rFonts w:cs="Times New Roman"/>
+                <w:bCs/>
+                <w:szCs w:val="24"/>
+              </w:rPr>
+              <w:t>risks, tools, or implementation details. Mark unsupported information</w:t>
+            </w:r>
+          </w:p>
+          <w:p>
+            <w:pPr>
+              <w:spacing w:line="480" w:lineRule="auto"/>
+              <w:rPr>
+                <w:rFonts w:cs="Times New Roman"/>
+                <w:bCs/>
+                <w:szCs w:val="24"/>
+              </w:rPr>
+            </w:pPr>
+            <w:r>
+              <w:rPr>
+                <w:rFonts w:cs="Times New Roman"/>
+                <w:bCs/>
+                <w:szCs w:val="24"/>
+              </w:rPr>
+              <w:t>as To Be Completed.</w:t>
+            </w:r>
+          </w:p>
+          <w:p>
+            <w:pPr>
+              <w:spacing w:line="480" w:lineRule="auto"/>
+              <w:rPr>
+                <w:rFonts w:cs="Times New Roman"/>
+                <w:bCs/>
+                <w:szCs w:val="24"/>
+              </w:rPr>
+            </w:pPr>
+          </w:p>
+        </w:tc>
+        <w:tc>
+          <w:tcPr>
+            <w:tcW w:w="3250" w:type="dxa"/>
+          </w:tcPr>
+          <w:p>
+            <w:pPr>
+              <w:spacing w:line="480" w:lineRule="auto"/>
+              <w:rPr>
+                <w:rFonts w:cs="Times New Roman"/>
+                <w:bCs/>
+                <w:szCs w:val="24"/>
+              </w:rPr>
+            </w:pPr>
+            <w:r>
+              <w:rPr>
+                <w:rFonts w:cs="Times New Roman"/>
+                <w:bCs/>
+                <w:szCs w:val="24"/>
+              </w:rPr>
+              <w:t>I used this to update my PRD.md File</w:t>
+            </w:r>
+          </w:p>
+        </w:tc>
+      </w:tr>
+      <w:tr>
+        <w:tc>
+          <w:tcPr>
+            <w:tcW w:w="2169" w:type="dxa"/>
+          </w:tcPr>
+          <w:p>
+            <w:pPr>
+              <w:spacing w:line="480" w:lineRule="auto"/>
+              <w:rPr>
+                <w:rFonts w:cs="Times New Roman"/>
+                <w:bCs/>
+                <w:szCs w:val="24"/>
+              </w:rPr>
+            </w:pPr>
+            <w:r>
+              <w:rPr>
+                <w:rFonts w:cs="Times New Roman"/>
+                <w:bCs/>
+                <w:szCs w:val="24"/>
+              </w:rPr>
+              <w:lastRenderedPageBreak/>
+              <w:t>Copilot</w:t>
+            </w:r>
+          </w:p>
+        </w:tc>
+        <w:tc>
+          <w:tcPr>
+            <w:tcW w:w="982" w:type="dxa"/>
+          </w:tcPr>
+          <w:p>
+            <w:pPr>
+              <w:spacing w:line="480" w:lineRule="auto"/>
+              <w:rPr>
+                <w:rFonts w:cs="Times New Roman"/>
+                <w:bCs/>
+                <w:szCs w:val="24"/>
+              </w:rPr>
+            </w:pPr>
+            <w:r>
+              <w:rPr>
+                <w:rFonts w:cs="Times New Roman"/>
+                <w:bCs/>
+                <w:szCs w:val="24"/>
+              </w:rPr>
+              <w:t>8/5</w:t>
+            </w:r>
+          </w:p>
+        </w:tc>
+        <w:tc>
+          <w:tcPr>
+            <w:tcW w:w="2949" w:type="dxa"/>
+          </w:tcPr>
+          <w:p>
+            <w:pPr>
+              <w:spacing w:line="480" w:lineRule="auto"/>
+              <w:rPr>
+                <w:rFonts w:cs="Times New Roman"/>
+                <w:bCs/>
+                <w:szCs w:val="24"/>
+              </w:rPr>
+            </w:pPr>
+            <w:r>
+              <w:rPr>
+                <w:rFonts w:cs="Times New Roman"/>
+                <w:bCs/>
+                <w:szCs w:val="24"/>
+              </w:rPr>
+              <w:t>Based on the requriments in PRD.md. Build a file callsed documents/requirements.txt. This document should accuretly reflect the requirments lead out in PRD.md including Undesirable Events, Risk Analysis, Risk Prioritization, Risk Mitigation, Functional Requirements, Quality Requirements, Performance Requirements, and Requirements Traceability Matrix.</w:t>
+            </w:r>
+          </w:p>
+          <w:p>
+            <w:pPr>
+              <w:spacing w:line="480" w:lineRule="auto"/>
+              <w:rPr>
+                <w:rFonts w:cs="Times New Roman"/>
+                <w:bCs/>
+                <w:szCs w:val="24"/>
+              </w:rPr>
+            </w:pPr>
+            <w:r>
+              <w:rPr>
+                <w:rFonts w:cs="Times New Roman"/>
+                <w:bCs/>
+                <w:szCs w:val="24"/>
+              </w:rPr>
+              <w:t>Do not invent requrimetns that are not listed in PRD.md. Do not create any files other then documents/requirements.txt.</w:t>
+            </w:r>
+          </w:p>
+          <w:p>
+            <w:pPr>
+              <w:spacing w:line="480" w:lineRule="auto"/>
+              <w:rPr>
+                <w:rFonts w:cs="Times New Roman"/>
+                <w:bCs/>
+                <w:szCs w:val="24"/>
+              </w:rPr>
+            </w:pPr>
+          </w:p>
+        </w:tc>
+        <w:tc>
+          <w:tcPr>
+            <w:tcW w:w="3250" w:type="dxa"/>
+          </w:tcPr>
+          <w:p>
+            <w:pPr>
+              <w:spacing w:line="480" w:lineRule="auto"/>
+              <w:rPr>
+                <w:rFonts w:cs="Times New Roman"/>
+                <w:bCs/>
+                <w:szCs w:val="24"/>
+              </w:rPr>
+            </w:pPr>
+            <w:r>
+              <w:rPr>
+                <w:rFonts w:cs="Times New Roman"/>
+                <w:bCs/>
+                <w:szCs w:val="24"/>
+              </w:rPr>
+              <w:t xml:space="preserve">I used this to create the file </w:t>
+            </w:r>
+            <w:r>
+              <w:rPr>
+                <w:rFonts w:cs="Times New Roman"/>
+                <w:bCs/>
+                <w:szCs w:val="24"/>
+              </w:rPr>
+              <w:t>documents/requirements.txt</w:t>
+            </w:r>
+            <w:r>
+              <w:rPr>
+                <w:rFonts w:cs="Times New Roman"/>
+                <w:bCs/>
+                <w:szCs w:val="24"/>
+              </w:rPr>
+              <w:t xml:space="preserve"> based on the PRD report.</w:t>
+            </w:r>
+          </w:p>
+        </w:tc>
+      </w:tr>
+      <w:tr>
+        <w:tc>
+          <w:tcPr>
+            <w:tcW w:w="2169" w:type="dxa"/>
+          </w:tcPr>
+          <w:p>
+            <w:pPr>
+              <w:spacing w:line="480" w:lineRule="auto"/>
+              <w:rPr>
+                <w:rFonts w:cs="Times New Roman"/>
+                <w:bCs/>
+                <w:szCs w:val="24"/>
+              </w:rPr>
+            </w:pPr>
+            <w:r>
+              <w:rPr>
+                <w:rFonts w:cs="Times New Roman"/>
+                <w:bCs/>
+                <w:szCs w:val="24"/>
+              </w:rPr>
+              <w:lastRenderedPageBreak/>
+              <w:t>Copilot</w:t>
+            </w:r>
+          </w:p>
+        </w:tc>
+        <w:tc>
+          <w:tcPr>
+            <w:tcW w:w="982" w:type="dxa"/>
+          </w:tcPr>
+          <w:p>
+            <w:pPr>
+              <w:spacing w:line="480" w:lineRule="auto"/>
+              <w:rPr>
+                <w:rFonts w:cs="Times New Roman"/>
+                <w:bCs/>
+                <w:szCs w:val="24"/>
+              </w:rPr>
+            </w:pPr>
+            <w:r>
+              <w:rPr>
+                <w:rFonts w:cs="Times New Roman"/>
+                <w:bCs/>
+                <w:szCs w:val="24"/>
+              </w:rPr>
+              <w:t>8/5</w:t>
+            </w:r>
+          </w:p>
+        </w:tc>
+        <w:tc>
+          <w:tcPr>
+            <w:tcW w:w="2949" w:type="dxa"/>
+          </w:tcPr>
+          <w:p>
+            <w:pPr>
+              <w:spacing w:line="480" w:lineRule="auto"/>
+              <w:rPr>
+                <w:rFonts w:cs="Times New Roman"/>
+                <w:bCs/>
+                <w:szCs w:val="24"/>
+              </w:rPr>
+            </w:pPr>
+            <w:r>
+              <w:rPr>
+                <w:rFonts w:cs="Times New Roman"/>
+                <w:bCs/>
+                <w:szCs w:val="24"/>
+              </w:rPr>
+              <w:t>generate-Software-Test-Plan-and-Report</w:t>
+            </w:r>
+          </w:p>
+          <w:p>
+            <w:pPr>
+              <w:spacing w:line="480" w:lineRule="auto"/>
+              <w:rPr>
+                <w:rFonts w:cs="Times New Roman"/>
+                <w:bCs/>
+                <w:szCs w:val="24"/>
+              </w:rPr>
+            </w:pPr>
+          </w:p>
+          <w:p>
+            <w:pPr>
+              <w:spacing w:line="480" w:lineRule="auto"/>
+              <w:rPr>
+                <w:rFonts w:cs="Times New Roman"/>
+                <w:bCs/>
+                <w:szCs w:val="24"/>
+              </w:rPr>
+            </w:pPr>
+            <w:r>
+              <w:rPr>
+                <w:rFonts w:cs="Times New Roman"/>
+                <w:bCs/>
+                <w:szCs w:val="24"/>
+              </w:rPr>
+              <w:t>Analyze the complete repository using #codebase. Create or update</w:t>
+            </w:r>
+          </w:p>
+          <w:p>
+            <w:pPr>
+              <w:spacing w:line="480" w:lineRule="auto"/>
+              <w:rPr>
+                <w:rFonts w:cs="Times New Roman"/>
+                <w:bCs/>
+                <w:szCs w:val="24"/>
+              </w:rPr>
+            </w:pPr>
+            <w:r>
+              <w:rPr>
+                <w:rFonts w:cs="Times New Roman"/>
+                <w:bCs/>
+                <w:szCs w:val="24"/>
+              </w:rPr>
+              <w:t>/documents/Software-Test-Plan-and-Report.md. Base the document on evidence</w:t>
+            </w:r>
+          </w:p>
+          <w:p>
+            <w:pPr>
+              <w:spacing w:line="480" w:lineRule="auto"/>
+              <w:rPr>
+                <w:rFonts w:cs="Times New Roman"/>
+                <w:bCs/>
+                <w:szCs w:val="24"/>
+              </w:rPr>
+            </w:pPr>
+            <w:r>
+              <w:rPr>
+                <w:rFonts w:cs="Times New Roman"/>
+                <w:bCs/>
+                <w:szCs w:val="24"/>
+              </w:rPr>
+              <w:t>from the repository. Do not invent features, requirements, test results,</w:t>
+            </w:r>
+          </w:p>
+          <w:p>
+            <w:pPr>
+              <w:spacing w:line="480" w:lineRule="auto"/>
+              <w:rPr>
+                <w:rFonts w:cs="Times New Roman"/>
+                <w:bCs/>
+                <w:szCs w:val="24"/>
+              </w:rPr>
+            </w:pPr>
+            <w:r>
+              <w:rPr>
+                <w:rFonts w:cs="Times New Roman"/>
+                <w:bCs/>
+                <w:szCs w:val="24"/>
+              </w:rPr>
+              <w:t>risks, tools, or implementation details. Mark unsupported information</w:t>
+            </w:r>
+          </w:p>
+          <w:p>
+            <w:pPr>
+              <w:spacing w:line="480" w:lineRule="auto"/>
+              <w:rPr>
+                <w:rFonts w:cs="Times New Roman"/>
+                <w:bCs/>
+                <w:szCs w:val="24"/>
+              </w:rPr>
+            </w:pPr>
+            <w:r>
+              <w:rPr>
+                <w:rFonts w:cs="Times New Roman"/>
+                <w:bCs/>
+                <w:szCs w:val="24"/>
+              </w:rPr>
+              <w:t>as To Be Completed.</w:t>
+            </w:r>
+          </w:p>
+        </w:tc>
+        <w:tc>
+          <w:tcPr>
+            <w:tcW w:w="3250" w:type="dxa"/>
+          </w:tcPr>
+          <w:p>
+            <w:pPr>
+              <w:spacing w:line="480" w:lineRule="auto"/>
+              <w:rPr>
+                <w:rFonts w:cs="Times New Roman"/>
+                <w:bCs/>
+                <w:szCs w:val="24"/>
+              </w:rPr>
+            </w:pPr>
+            <w:r>
+              <w:rPr>
+                <w:rFonts w:cs="Times New Roman"/>
+                <w:bCs/>
+                <w:szCs w:val="24"/>
+              </w:rPr>
+              <w:t xml:space="preserve">I used this to update </w:t>
+            </w:r>
+            <w:r>
+              <w:rPr>
+                <w:rFonts w:cs="Times New Roman"/>
+                <w:bCs/>
+                <w:szCs w:val="24"/>
+              </w:rPr>
+              <w:t>Software-Test-Plan-and-Report.md</w:t>
+            </w:r>
           </w:p>
         </w:tc>
       </w:tr>
@@ -1124,7 +1983,7 @@
     </w:p>
     <w:p/>
     <w:sectPr>
-      <w:headerReference w:type="default" r:id="rId6"/>
+      <w:headerReference w:type="default" r:id="rId8"/>
       <w:pgSz w:w="12240" w:h="15840"/>
       <w:pgMar w:top="1440" w:right="1440" w:bottom="1440" w:left="1440" w:header="720" w:footer="720" w:gutter="0"/>
       <w:cols w:space="720"/>
@@ -1899,6 +2758,7 @@
   <w:style w:type="character" w:default="1" w:styleId="DefaultParagraphFont">
     <w:name w:val="Default Paragraph Font"/>
     <w:uiPriority w:val="1"/>
+    <w:semiHidden/>
     <w:unhideWhenUsed/>
   </w:style>
   <w:style w:type="table" w:default="1" w:styleId="TableNormal">
@@ -2282,6 +3142,29 @@
         <w:insideV w:val="single" w:sz="4" w:space="0" w:color="auto"/>
       </w:tblBorders>
     </w:tblPr>
+  </w:style>
+  <w:style w:type="character" w:styleId="Hyperlink">
+    <w:name w:val="Hyperlink"/>
+    <w:basedOn w:val="DefaultParagraphFont"/>
+    <w:uiPriority w:val="99"/>
+    <w:unhideWhenUsed/>
+    <w:rsid w:val="00FD13C4"/>
+    <w:rPr>
+      <w:color w:val="467886" w:themeColor="hyperlink"/>
+      <w:u w:val="single"/>
+    </w:rPr>
+  </w:style>
+  <w:style w:type="character" w:styleId="UnresolvedMention">
+    <w:name w:val="Unresolved Mention"/>
+    <w:basedOn w:val="DefaultParagraphFont"/>
+    <w:uiPriority w:val="99"/>
+    <w:semiHidden/>
+    <w:unhideWhenUsed/>
+    <w:rsid w:val="00FD13C4"/>
+    <w:rPr>
+      <w:color w:val="605E5C"/>
+      <w:shd w:val="clear" w:color="auto" w:fill="E1DFDD"/>
+    </w:rPr>
   </w:style>
 </w:styles>
 </file>

</xml_diff>

<commit_message>
update to class imports + final output of sim2
</commit_message>
<xml_diff>
--- a/documents/archived/Week13-AI-Logs.docx
+++ b/documents/archived/Week13-AI-Logs.docx
@@ -28,15 +28,15 @@
         <w:tblLook w:val="04A0" w:firstRow="1" w:lastRow="0" w:firstColumn="1" w:lastColumn="0" w:noHBand="0" w:noVBand="1"/>
       </w:tblPr>
       <w:tblGrid>
-        <w:gridCol w:w="2169"/>
-        <w:gridCol w:w="982"/>
-        <w:gridCol w:w="2949"/>
-        <w:gridCol w:w="3250"/>
+        <w:gridCol w:w="1970"/>
+        <w:gridCol w:w="932"/>
+        <w:gridCol w:w="3256"/>
+        <w:gridCol w:w="3192"/>
       </w:tblGrid>
       <w:tr>
         <w:tc>
           <w:tcPr>
-            <w:tcW w:w="2169" w:type="dxa"/>
+            <w:tcW w:w="1970" w:type="dxa"/>
           </w:tcPr>
           <w:p>
             <w:pPr>
@@ -59,7 +59,7 @@
         </w:tc>
         <w:tc>
           <w:tcPr>
-            <w:tcW w:w="982" w:type="dxa"/>
+            <w:tcW w:w="932" w:type="dxa"/>
           </w:tcPr>
           <w:p>
             <w:pPr>
@@ -82,7 +82,7 @@
         </w:tc>
         <w:tc>
           <w:tcPr>
-            <w:tcW w:w="2949" w:type="dxa"/>
+            <w:tcW w:w="3256" w:type="dxa"/>
           </w:tcPr>
           <w:p>
             <w:pPr>
@@ -105,7 +105,7 @@
         </w:tc>
         <w:tc>
           <w:tcPr>
-            <w:tcW w:w="3250" w:type="dxa"/>
+            <w:tcW w:w="3192" w:type="dxa"/>
           </w:tcPr>
           <w:p>
             <w:pPr>
@@ -130,7 +130,7 @@
       <w:tr>
         <w:tc>
           <w:tcPr>
-            <w:tcW w:w="2169" w:type="dxa"/>
+            <w:tcW w:w="1970" w:type="dxa"/>
           </w:tcPr>
           <w:p>
             <w:pPr>
@@ -153,7 +153,7 @@
         </w:tc>
         <w:tc>
           <w:tcPr>
-            <w:tcW w:w="982" w:type="dxa"/>
+            <w:tcW w:w="932" w:type="dxa"/>
           </w:tcPr>
           <w:p>
             <w:pPr>
@@ -176,7 +176,7 @@
         </w:tc>
         <w:tc>
           <w:tcPr>
-            <w:tcW w:w="2949" w:type="dxa"/>
+            <w:tcW w:w="3256" w:type="dxa"/>
           </w:tcPr>
           <w:p>
             <w:pPr>
@@ -199,24 +199,60 @@
         </w:tc>
         <w:tc>
           <w:tcPr>
-            <w:tcW w:w="3250" w:type="dxa"/>
-          </w:tcPr>
-          <w:p>
-            <w:pPr>
-              <w:spacing w:line="480" w:lineRule="auto"/>
-              <w:rPr>
-                <w:rFonts w:cs="Times New Roman"/>
-                <w:bCs/>
-                <w:szCs w:val="24"/>
-              </w:rPr>
-            </w:pPr>
-            <w:r>
-              <w:rPr>
-                <w:rFonts w:cs="Times New Roman"/>
-                <w:bCs/>
-                <w:szCs w:val="24"/>
-              </w:rPr>
-              <w:t>I used this to filter the out the failed hunts form the pool</w:t>
+            <w:tcW w:w="3192" w:type="dxa"/>
+          </w:tcPr>
+          <w:p>
+            <w:pPr>
+              <w:spacing w:line="480" w:lineRule="auto"/>
+              <w:rPr>
+                <w:rFonts w:cs="Times New Roman"/>
+                <w:bCs/>
+                <w:szCs w:val="24"/>
+              </w:rPr>
+            </w:pPr>
+            <w:r>
+              <w:rPr>
+                <w:rFonts w:cs="Times New Roman"/>
+                <w:bCs/>
+                <w:szCs w:val="24"/>
+              </w:rPr>
+              <w:t xml:space="preserve">I used this to filter </w:t>
+            </w:r>
+            <w:proofErr w:type="gramStart"/>
+            <w:r>
+              <w:rPr>
+                <w:rFonts w:cs="Times New Roman"/>
+                <w:bCs/>
+                <w:szCs w:val="24"/>
+              </w:rPr>
+              <w:t>the out</w:t>
+            </w:r>
+            <w:proofErr w:type="gramEnd"/>
+            <w:r>
+              <w:rPr>
+                <w:rFonts w:cs="Times New Roman"/>
+                <w:bCs/>
+                <w:szCs w:val="24"/>
+              </w:rPr>
+              <w:t xml:space="preserve"> the failed hunts </w:t>
+            </w:r>
+            <w:proofErr w:type="gramStart"/>
+            <w:r>
+              <w:rPr>
+                <w:rFonts w:cs="Times New Roman"/>
+                <w:bCs/>
+                <w:szCs w:val="24"/>
+              </w:rPr>
+              <w:t>form</w:t>
+            </w:r>
+            <w:proofErr w:type="gramEnd"/>
+            <w:r>
+              <w:rPr>
+                <w:rFonts w:cs="Times New Roman"/>
+                <w:bCs/>
+                <w:szCs w:val="24"/>
+              </w:rPr>
+              <w:t xml:space="preserve"> the pool</w:t>
             </w:r>
           </w:p>
         </w:tc>
@@ -224,7 +260,7 @@
       <w:tr>
         <w:tc>
           <w:tcPr>
-            <w:tcW w:w="2169" w:type="dxa"/>
+            <w:tcW w:w="1970" w:type="dxa"/>
           </w:tcPr>
           <w:p>
             <w:pPr>
@@ -247,7 +283,7 @@
         </w:tc>
         <w:tc>
           <w:tcPr>
-            <w:tcW w:w="982" w:type="dxa"/>
+            <w:tcW w:w="932" w:type="dxa"/>
           </w:tcPr>
           <w:p>
             <w:pPr>
@@ -270,7 +306,7 @@
         </w:tc>
         <w:tc>
           <w:tcPr>
-            <w:tcW w:w="2949" w:type="dxa"/>
+            <w:tcW w:w="3256" w:type="dxa"/>
           </w:tcPr>
           <w:p>
             <w:pPr>
@@ -293,7 +329,7 @@
         </w:tc>
         <w:tc>
           <w:tcPr>
-            <w:tcW w:w="3250" w:type="dxa"/>
+            <w:tcW w:w="3192" w:type="dxa"/>
           </w:tcPr>
           <w:p>
             <w:pPr>
@@ -318,7 +354,7 @@
       <w:tr>
         <w:tc>
           <w:tcPr>
-            <w:tcW w:w="2169" w:type="dxa"/>
+            <w:tcW w:w="1970" w:type="dxa"/>
           </w:tcPr>
           <w:p>
             <w:pPr>
@@ -341,7 +377,7 @@
         </w:tc>
         <w:tc>
           <w:tcPr>
-            <w:tcW w:w="982" w:type="dxa"/>
+            <w:tcW w:w="932" w:type="dxa"/>
           </w:tcPr>
           <w:p>
             <w:pPr>
@@ -364,7 +400,7 @@
         </w:tc>
         <w:tc>
           <w:tcPr>
-            <w:tcW w:w="2949" w:type="dxa"/>
+            <w:tcW w:w="3256" w:type="dxa"/>
           </w:tcPr>
           <w:p>
             <w:pPr>
@@ -387,7 +423,7 @@
         </w:tc>
         <w:tc>
           <w:tcPr>
-            <w:tcW w:w="3250" w:type="dxa"/>
+            <w:tcW w:w="3192" w:type="dxa"/>
           </w:tcPr>
           <w:p>
             <w:pPr>
@@ -428,7 +464,7 @@
       <w:tr>
         <w:tc>
           <w:tcPr>
-            <w:tcW w:w="2169" w:type="dxa"/>
+            <w:tcW w:w="1970" w:type="dxa"/>
           </w:tcPr>
           <w:p>
             <w:pPr>
@@ -451,7 +487,7 @@
         </w:tc>
         <w:tc>
           <w:tcPr>
-            <w:tcW w:w="982" w:type="dxa"/>
+            <w:tcW w:w="932" w:type="dxa"/>
           </w:tcPr>
           <w:p>
             <w:pPr>
@@ -474,7 +510,7 @@
         </w:tc>
         <w:tc>
           <w:tcPr>
-            <w:tcW w:w="2949" w:type="dxa"/>
+            <w:tcW w:w="3256" w:type="dxa"/>
           </w:tcPr>
           <w:p>
             <w:pPr>
@@ -497,7 +533,7 @@
         </w:tc>
         <w:tc>
           <w:tcPr>
-            <w:tcW w:w="3250" w:type="dxa"/>
+            <w:tcW w:w="3192" w:type="dxa"/>
           </w:tcPr>
           <w:p>
             <w:pPr>
@@ -522,7 +558,7 @@
       <w:tr>
         <w:tc>
           <w:tcPr>
-            <w:tcW w:w="2169" w:type="dxa"/>
+            <w:tcW w:w="1970" w:type="dxa"/>
           </w:tcPr>
           <w:p>
             <w:pPr>
@@ -545,7 +581,7 @@
         </w:tc>
         <w:tc>
           <w:tcPr>
-            <w:tcW w:w="982" w:type="dxa"/>
+            <w:tcW w:w="932" w:type="dxa"/>
           </w:tcPr>
           <w:p>
             <w:pPr>
@@ -568,7 +604,7 @@
         </w:tc>
         <w:tc>
           <w:tcPr>
-            <w:tcW w:w="2949" w:type="dxa"/>
+            <w:tcW w:w="3256" w:type="dxa"/>
           </w:tcPr>
           <w:p>
             <w:pPr>
@@ -591,24 +627,33 @@
         </w:tc>
         <w:tc>
           <w:tcPr>
-            <w:tcW w:w="3250" w:type="dxa"/>
-          </w:tcPr>
-          <w:p>
-            <w:pPr>
-              <w:spacing w:line="480" w:lineRule="auto"/>
-              <w:rPr>
-                <w:rFonts w:cs="Times New Roman"/>
-                <w:bCs/>
-                <w:szCs w:val="24"/>
-              </w:rPr>
-            </w:pPr>
-            <w:r>
-              <w:rPr>
-                <w:rFonts w:cs="Times New Roman"/>
-                <w:bCs/>
-                <w:szCs w:val="24"/>
-              </w:rPr>
-              <w:t xml:space="preserve">I used this to learn how to get the </w:t>
+            <w:tcW w:w="3192" w:type="dxa"/>
+          </w:tcPr>
+          <w:p>
+            <w:pPr>
+              <w:spacing w:line="480" w:lineRule="auto"/>
+              <w:rPr>
+                <w:rFonts w:cs="Times New Roman"/>
+                <w:bCs/>
+                <w:szCs w:val="24"/>
+              </w:rPr>
+            </w:pPr>
+            <w:r>
+              <w:rPr>
+                <w:rFonts w:cs="Times New Roman"/>
+                <w:bCs/>
+                <w:szCs w:val="24"/>
+              </w:rPr>
+              <w:t xml:space="preserve">I used this to learn how to get </w:t>
+            </w:r>
+            <w:proofErr w:type="gramStart"/>
+            <w:r>
+              <w:rPr>
+                <w:rFonts w:cs="Times New Roman"/>
+                <w:bCs/>
+                <w:szCs w:val="24"/>
+              </w:rPr>
+              <w:t xml:space="preserve">the </w:t>
             </w:r>
             <w:r>
               <w:rPr>
@@ -618,6 +663,7 @@
               </w:rPr>
               <w:t>maxCycles</w:t>
             </w:r>
+            <w:proofErr w:type="gramEnd"/>
             <w:r>
               <w:rPr>
                 <w:rFonts w:cs="Times New Roman"/>
@@ -642,7 +688,7 @@
       <w:tr>
         <w:tc>
           <w:tcPr>
-            <w:tcW w:w="2169" w:type="dxa"/>
+            <w:tcW w:w="1970" w:type="dxa"/>
           </w:tcPr>
           <w:p>
             <w:pPr>
@@ -665,7 +711,7 @@
         </w:tc>
         <w:tc>
           <w:tcPr>
-            <w:tcW w:w="982" w:type="dxa"/>
+            <w:tcW w:w="932" w:type="dxa"/>
           </w:tcPr>
           <w:p>
             <w:pPr>
@@ -688,56 +734,46 @@
         </w:tc>
         <w:tc>
           <w:tcPr>
-            <w:tcW w:w="2949" w:type="dxa"/>
-          </w:tcPr>
-          <w:p>
-            <w:pPr>
-              <w:spacing w:line="480" w:lineRule="auto"/>
-              <w:rPr>
-                <w:rFonts w:cs="Times New Roman"/>
-                <w:bCs/>
-                <w:szCs w:val="24"/>
-              </w:rPr>
-            </w:pPr>
-            <w:r>
-              <w:rPr>
-                <w:rFonts w:cs="Times New Roman"/>
-                <w:bCs/>
-                <w:szCs w:val="24"/>
-              </w:rPr>
-              <w:t xml:space="preserve">how to get the top n items from a pandas dataframe in python sorting on one </w:t>
-            </w:r>
-            <w:r>
-              <w:rPr>
-                <w:rFonts w:cs="Times New Roman"/>
-                <w:bCs/>
-                <w:szCs w:val="24"/>
-              </w:rPr>
-              <w:lastRenderedPageBreak/>
-              <w:t>category first and then a second</w:t>
-            </w:r>
-          </w:p>
-        </w:tc>
-        <w:tc>
-          <w:tcPr>
-            <w:tcW w:w="3250" w:type="dxa"/>
-          </w:tcPr>
-          <w:p>
-            <w:pPr>
-              <w:spacing w:line="480" w:lineRule="auto"/>
-              <w:rPr>
-                <w:rFonts w:cs="Times New Roman"/>
-                <w:bCs/>
-                <w:szCs w:val="24"/>
-              </w:rPr>
-            </w:pPr>
-            <w:r>
-              <w:rPr>
-                <w:rFonts w:cs="Times New Roman"/>
-                <w:bCs/>
-                <w:szCs w:val="24"/>
-              </w:rPr>
-              <w:lastRenderedPageBreak/>
+            <w:tcW w:w="3256" w:type="dxa"/>
+          </w:tcPr>
+          <w:p>
+            <w:pPr>
+              <w:spacing w:line="480" w:lineRule="auto"/>
+              <w:rPr>
+                <w:rFonts w:cs="Times New Roman"/>
+                <w:bCs/>
+                <w:szCs w:val="24"/>
+              </w:rPr>
+            </w:pPr>
+            <w:r>
+              <w:rPr>
+                <w:rFonts w:cs="Times New Roman"/>
+                <w:bCs/>
+                <w:szCs w:val="24"/>
+              </w:rPr>
+              <w:t>how to get the top n items from a pandas dataframe in python sorting on one category first and then a second</w:t>
+            </w:r>
+          </w:p>
+        </w:tc>
+        <w:tc>
+          <w:tcPr>
+            <w:tcW w:w="3192" w:type="dxa"/>
+          </w:tcPr>
+          <w:p>
+            <w:pPr>
+              <w:spacing w:line="480" w:lineRule="auto"/>
+              <w:rPr>
+                <w:rFonts w:cs="Times New Roman"/>
+                <w:bCs/>
+                <w:szCs w:val="24"/>
+              </w:rPr>
+            </w:pPr>
+            <w:r>
+              <w:rPr>
+                <w:rFonts w:cs="Times New Roman"/>
+                <w:bCs/>
+                <w:szCs w:val="24"/>
+              </w:rPr>
               <w:t>I used this to learn how to filter using the first and second order for the population limmits</w:t>
             </w:r>
           </w:p>
@@ -746,30 +782,31 @@
       <w:tr>
         <w:tc>
           <w:tcPr>
-            <w:tcW w:w="2169" w:type="dxa"/>
-          </w:tcPr>
-          <w:p>
-            <w:pPr>
-              <w:spacing w:line="480" w:lineRule="auto"/>
-              <w:rPr>
-                <w:rFonts w:cs="Times New Roman"/>
-                <w:bCs/>
-                <w:szCs w:val="24"/>
-              </w:rPr>
-            </w:pPr>
-            <w:r>
-              <w:rPr>
-                <w:rFonts w:cs="Times New Roman"/>
-                <w:bCs/>
-                <w:szCs w:val="24"/>
-              </w:rPr>
+            <w:tcW w:w="1970" w:type="dxa"/>
+          </w:tcPr>
+          <w:p>
+            <w:pPr>
+              <w:spacing w:line="480" w:lineRule="auto"/>
+              <w:rPr>
+                <w:rFonts w:cs="Times New Roman"/>
+                <w:bCs/>
+                <w:szCs w:val="24"/>
+              </w:rPr>
+            </w:pPr>
+            <w:r>
+              <w:rPr>
+                <w:rFonts w:cs="Times New Roman"/>
+                <w:bCs/>
+                <w:szCs w:val="24"/>
+              </w:rPr>
+              <w:lastRenderedPageBreak/>
               <w:t>Gemini</w:t>
             </w:r>
           </w:p>
         </w:tc>
         <w:tc>
           <w:tcPr>
-            <w:tcW w:w="982" w:type="dxa"/>
+            <w:tcW w:w="932" w:type="dxa"/>
           </w:tcPr>
           <w:p>
             <w:pPr>
@@ -792,30 +829,48 @@
         </w:tc>
         <w:tc>
           <w:tcPr>
-            <w:tcW w:w="2949" w:type="dxa"/>
-          </w:tcPr>
-          <w:p>
-            <w:pPr>
-              <w:spacing w:line="480" w:lineRule="auto"/>
-              <w:rPr>
-                <w:rFonts w:cs="Times New Roman"/>
-                <w:bCs/>
-                <w:szCs w:val="24"/>
-              </w:rPr>
-            </w:pPr>
-            <w:r>
-              <w:rPr>
-                <w:rFonts w:cs="Times New Roman"/>
-                <w:bCs/>
-                <w:szCs w:val="24"/>
-              </w:rPr>
-              <w:t>loop through a pandas dataframe column</w:t>
-            </w:r>
-          </w:p>
-        </w:tc>
-        <w:tc>
-          <w:tcPr>
-            <w:tcW w:w="3250" w:type="dxa"/>
+            <w:tcW w:w="3256" w:type="dxa"/>
+          </w:tcPr>
+          <w:p>
+            <w:pPr>
+              <w:spacing w:line="480" w:lineRule="auto"/>
+              <w:rPr>
+                <w:rFonts w:cs="Times New Roman"/>
+                <w:bCs/>
+                <w:szCs w:val="24"/>
+              </w:rPr>
+            </w:pPr>
+            <w:r>
+              <w:rPr>
+                <w:rFonts w:cs="Times New Roman"/>
+                <w:bCs/>
+                <w:szCs w:val="24"/>
+              </w:rPr>
+              <w:t xml:space="preserve">loop through a </w:t>
+            </w:r>
+            <w:proofErr w:type="gramStart"/>
+            <w:r>
+              <w:rPr>
+                <w:rFonts w:cs="Times New Roman"/>
+                <w:bCs/>
+                <w:szCs w:val="24"/>
+              </w:rPr>
+              <w:t>pandas</w:t>
+            </w:r>
+            <w:proofErr w:type="gramEnd"/>
+            <w:r>
+              <w:rPr>
+                <w:rFonts w:cs="Times New Roman"/>
+                <w:bCs/>
+                <w:szCs w:val="24"/>
+              </w:rPr>
+              <w:t xml:space="preserve"> dataframe column</w:t>
+            </w:r>
+          </w:p>
+        </w:tc>
+        <w:tc>
+          <w:tcPr>
+            <w:tcW w:w="3192" w:type="dxa"/>
           </w:tcPr>
           <w:p>
             <w:pPr>
@@ -848,7 +903,7 @@
       <w:tr>
         <w:tc>
           <w:tcPr>
-            <w:tcW w:w="2169" w:type="dxa"/>
+            <w:tcW w:w="1970" w:type="dxa"/>
           </w:tcPr>
           <w:p>
             <w:pPr>
@@ -871,7 +926,7 @@
         </w:tc>
         <w:tc>
           <w:tcPr>
-            <w:tcW w:w="982" w:type="dxa"/>
+            <w:tcW w:w="932" w:type="dxa"/>
           </w:tcPr>
           <w:p>
             <w:pPr>
@@ -894,7 +949,7 @@
         </w:tc>
         <w:tc>
           <w:tcPr>
-            <w:tcW w:w="2949" w:type="dxa"/>
+            <w:tcW w:w="3256" w:type="dxa"/>
           </w:tcPr>
           <w:p>
             <w:pPr>
@@ -917,7 +972,7 @@
         </w:tc>
         <w:tc>
           <w:tcPr>
-            <w:tcW w:w="3250" w:type="dxa"/>
+            <w:tcW w:w="3192" w:type="dxa"/>
           </w:tcPr>
           <w:p>
             <w:pPr>
@@ -942,7 +997,7 @@
       <w:tr>
         <w:tc>
           <w:tcPr>
-            <w:tcW w:w="2169" w:type="dxa"/>
+            <w:tcW w:w="1970" w:type="dxa"/>
           </w:tcPr>
           <w:p>
             <w:pPr>
@@ -965,7 +1020,7 @@
         </w:tc>
         <w:tc>
           <w:tcPr>
-            <w:tcW w:w="982" w:type="dxa"/>
+            <w:tcW w:w="932" w:type="dxa"/>
           </w:tcPr>
           <w:p>
             <w:pPr>
@@ -988,7 +1043,7 @@
         </w:tc>
         <w:tc>
           <w:tcPr>
-            <w:tcW w:w="2949" w:type="dxa"/>
+            <w:tcW w:w="3256" w:type="dxa"/>
           </w:tcPr>
           <w:p>
             <w:pPr>
@@ -1011,24 +1066,42 @@
         </w:tc>
         <w:tc>
           <w:tcPr>
-            <w:tcW w:w="3250" w:type="dxa"/>
-          </w:tcPr>
-          <w:p>
-            <w:pPr>
-              <w:spacing w:line="480" w:lineRule="auto"/>
-              <w:rPr>
-                <w:rFonts w:cs="Times New Roman"/>
-                <w:bCs/>
-                <w:szCs w:val="24"/>
-              </w:rPr>
-            </w:pPr>
-            <w:r>
-              <w:rPr>
-                <w:rFonts w:cs="Times New Roman"/>
-                <w:bCs/>
-                <w:szCs w:val="24"/>
-              </w:rPr>
-              <w:t>I used this to learn how to use confirm that sort worked the same as topn.</w:t>
+            <w:tcW w:w="3192" w:type="dxa"/>
+          </w:tcPr>
+          <w:p>
+            <w:pPr>
+              <w:spacing w:line="480" w:lineRule="auto"/>
+              <w:rPr>
+                <w:rFonts w:cs="Times New Roman"/>
+                <w:bCs/>
+                <w:szCs w:val="24"/>
+              </w:rPr>
+            </w:pPr>
+            <w:r>
+              <w:rPr>
+                <w:rFonts w:cs="Times New Roman"/>
+                <w:bCs/>
+                <w:szCs w:val="24"/>
+              </w:rPr>
+              <w:t xml:space="preserve">I used this to learn how </w:t>
+            </w:r>
+            <w:proofErr w:type="gramStart"/>
+            <w:r>
+              <w:rPr>
+                <w:rFonts w:cs="Times New Roman"/>
+                <w:bCs/>
+                <w:szCs w:val="24"/>
+              </w:rPr>
+              <w:t>to use</w:t>
+            </w:r>
+            <w:proofErr w:type="gramEnd"/>
+            <w:r>
+              <w:rPr>
+                <w:rFonts w:cs="Times New Roman"/>
+                <w:bCs/>
+                <w:szCs w:val="24"/>
+              </w:rPr>
+              <w:t xml:space="preserve"> confirm that sort worked the same as topn.</w:t>
             </w:r>
           </w:p>
         </w:tc>
@@ -1036,7 +1109,7 @@
       <w:tr>
         <w:tc>
           <w:tcPr>
-            <w:tcW w:w="2169" w:type="dxa"/>
+            <w:tcW w:w="1970" w:type="dxa"/>
           </w:tcPr>
           <w:p>
             <w:pPr>
@@ -1059,7 +1132,7 @@
         </w:tc>
         <w:tc>
           <w:tcPr>
-            <w:tcW w:w="982" w:type="dxa"/>
+            <w:tcW w:w="932" w:type="dxa"/>
           </w:tcPr>
           <w:p>
             <w:pPr>
@@ -1090,24 +1163,42 @@
         </w:tc>
         <w:tc>
           <w:tcPr>
-            <w:tcW w:w="2949" w:type="dxa"/>
-          </w:tcPr>
-          <w:p>
-            <w:pPr>
-              <w:spacing w:line="480" w:lineRule="auto"/>
-              <w:rPr>
-                <w:rFonts w:cs="Times New Roman"/>
-                <w:bCs/>
-                <w:szCs w:val="24"/>
-              </w:rPr>
-            </w:pPr>
-            <w:r>
-              <w:rPr>
-                <w:rFonts w:cs="Times New Roman"/>
-                <w:bCs/>
-                <w:szCs w:val="24"/>
-              </w:rPr>
-              <w:t xml:space="preserve">Read #codebase and produce a ci.yml in the folder .github/workflows to run and verify the class-level testers in /classes folder. </w:t>
+            <w:tcW w:w="3256" w:type="dxa"/>
+          </w:tcPr>
+          <w:p>
+            <w:pPr>
+              <w:spacing w:line="480" w:lineRule="auto"/>
+              <w:rPr>
+                <w:rFonts w:cs="Times New Roman"/>
+                <w:bCs/>
+                <w:szCs w:val="24"/>
+              </w:rPr>
+            </w:pPr>
+            <w:r>
+              <w:rPr>
+                <w:rFonts w:cs="Times New Roman"/>
+                <w:bCs/>
+                <w:szCs w:val="24"/>
+              </w:rPr>
+              <w:t xml:space="preserve">Read #codebase and produce a ci.yml in the </w:t>
+            </w:r>
+            <w:proofErr w:type="gramStart"/>
+            <w:r>
+              <w:rPr>
+                <w:rFonts w:cs="Times New Roman"/>
+                <w:bCs/>
+                <w:szCs w:val="24"/>
+              </w:rPr>
+              <w:t>folder .github</w:t>
+            </w:r>
+            <w:proofErr w:type="gramEnd"/>
+            <w:r>
+              <w:rPr>
+                <w:rFonts w:cs="Times New Roman"/>
+                <w:bCs/>
+                <w:szCs w:val="24"/>
+              </w:rPr>
+              <w:t xml:space="preserve">/workflows to run and verify the class-level testers in /classes folder. </w:t>
             </w:r>
             <w:r>
               <w:rPr>
@@ -1124,16 +1215,25 @@
                 <w:szCs w:val="24"/>
               </w:rPr>
               <w:br/>
-              <w:t xml:space="preserve">Do not change or produce any code or folders outside of the .github/workflows folder. Do not make up tests </w:t>
-            </w:r>
-            <w:r>
-              <w:rPr>
-                <w:rFonts w:cs="Times New Roman"/>
-                <w:bCs/>
-                <w:szCs w:val="24"/>
-              </w:rPr>
-              <w:lastRenderedPageBreak/>
-              <w:t>that are not based on the class-level testers. </w:t>
+              <w:t xml:space="preserve">Do not change or produce any code or folders outside of </w:t>
+            </w:r>
+            <w:proofErr w:type="gramStart"/>
+            <w:r>
+              <w:rPr>
+                <w:rFonts w:cs="Times New Roman"/>
+                <w:bCs/>
+                <w:szCs w:val="24"/>
+              </w:rPr>
+              <w:t>the .github</w:t>
+            </w:r>
+            <w:proofErr w:type="gramEnd"/>
+            <w:r>
+              <w:rPr>
+                <w:rFonts w:cs="Times New Roman"/>
+                <w:bCs/>
+                <w:szCs w:val="24"/>
+              </w:rPr>
+              <w:t>/workflows folder. Do not make up tests that are not based on the class-level testers. </w:t>
             </w:r>
           </w:p>
           <w:p>
@@ -1243,7 +1343,7 @@
         </w:tc>
         <w:tc>
           <w:tcPr>
-            <w:tcW w:w="3250" w:type="dxa"/>
+            <w:tcW w:w="3192" w:type="dxa"/>
           </w:tcPr>
           <w:p>
             <w:pPr>
@@ -1269,7 +1369,7 @@
       <w:tr>
         <w:tc>
           <w:tcPr>
-            <w:tcW w:w="2169" w:type="dxa"/>
+            <w:tcW w:w="1970" w:type="dxa"/>
           </w:tcPr>
           <w:p>
             <w:pPr>
@@ -1292,7 +1392,7 @@
         </w:tc>
         <w:tc>
           <w:tcPr>
-            <w:tcW w:w="982" w:type="dxa"/>
+            <w:tcW w:w="932" w:type="dxa"/>
           </w:tcPr>
           <w:p>
             <w:pPr>
@@ -1315,7 +1415,7 @@
         </w:tc>
         <w:tc>
           <w:tcPr>
-            <w:tcW w:w="2949" w:type="dxa"/>
+            <w:tcW w:w="3256" w:type="dxa"/>
           </w:tcPr>
           <w:p>
             <w:pPr>
@@ -1359,7 +1459,25 @@
                 <w:szCs w:val="24"/>
               </w:rPr>
               <w:br/>
-              <w:t>/documents/CM_report.md. Base the document on evidence</w:t>
+              <w:t xml:space="preserve">/documents/CM_report.md. </w:t>
+            </w:r>
+            <w:proofErr w:type="gramStart"/>
+            <w:r>
+              <w:rPr>
+                <w:rFonts w:cs="Times New Roman"/>
+                <w:bCs/>
+                <w:szCs w:val="24"/>
+              </w:rPr>
+              <w:t>Base the document</w:t>
+            </w:r>
+            <w:proofErr w:type="gramEnd"/>
+            <w:r>
+              <w:rPr>
+                <w:rFonts w:cs="Times New Roman"/>
+                <w:bCs/>
+                <w:szCs w:val="24"/>
+              </w:rPr>
+              <w:t xml:space="preserve"> on evidence</w:t>
             </w:r>
             <w:r>
               <w:rPr>
@@ -1368,7 +1486,16 @@
                 <w:szCs w:val="24"/>
               </w:rPr>
               <w:br/>
-              <w:t xml:space="preserve">from the repository. Do not </w:t>
+              <w:t>from the repository. Do not invent features, requirements, test results,</w:t>
+            </w:r>
+            <w:r>
+              <w:rPr>
+                <w:rFonts w:cs="Times New Roman"/>
+                <w:bCs/>
+                <w:szCs w:val="24"/>
+              </w:rPr>
+              <w:br/>
+              <w:t xml:space="preserve">risks, tools, or implementation </w:t>
             </w:r>
             <w:r>
               <w:rPr>
@@ -1377,16 +1504,7 @@
                 <w:szCs w:val="24"/>
               </w:rPr>
               <w:lastRenderedPageBreak/>
-              <w:t>invent features, requirements, test results,</w:t>
-            </w:r>
-            <w:r>
-              <w:rPr>
-                <w:rFonts w:cs="Times New Roman"/>
-                <w:bCs/>
-                <w:szCs w:val="24"/>
-              </w:rPr>
-              <w:br/>
-              <w:t>risks, tools, or implementation details. Mark unsupported information</w:t>
+              <w:t>details. Mark unsupported information</w:t>
             </w:r>
             <w:r>
               <w:rPr>
@@ -1411,7 +1529,7 @@
         </w:tc>
         <w:tc>
           <w:tcPr>
-            <w:tcW w:w="3250" w:type="dxa"/>
+            <w:tcW w:w="3192" w:type="dxa"/>
           </w:tcPr>
           <w:p>
             <w:pPr>
@@ -1437,7 +1555,7 @@
       <w:tr>
         <w:tc>
           <w:tcPr>
-            <w:tcW w:w="2169" w:type="dxa"/>
+            <w:tcW w:w="1970" w:type="dxa"/>
           </w:tcPr>
           <w:p>
             <w:pPr>
@@ -1460,7 +1578,7 @@
         </w:tc>
         <w:tc>
           <w:tcPr>
-            <w:tcW w:w="982" w:type="dxa"/>
+            <w:tcW w:w="932" w:type="dxa"/>
           </w:tcPr>
           <w:p>
             <w:pPr>
@@ -1483,7 +1601,7 @@
         </w:tc>
         <w:tc>
           <w:tcPr>
-            <w:tcW w:w="2949" w:type="dxa"/>
+            <w:tcW w:w="3256" w:type="dxa"/>
           </w:tcPr>
           <w:p>
             <w:pPr>
@@ -1536,7 +1654,25 @@
                 <w:bCs/>
                 <w:szCs w:val="24"/>
               </w:rPr>
-              <w:t>/documents/PRD.md. Base the document on evidence</w:t>
+              <w:t xml:space="preserve">/documents/PRD.md. </w:t>
+            </w:r>
+            <w:proofErr w:type="gramStart"/>
+            <w:r>
+              <w:rPr>
+                <w:rFonts w:cs="Times New Roman"/>
+                <w:bCs/>
+                <w:szCs w:val="24"/>
+              </w:rPr>
+              <w:t>Base</w:t>
+            </w:r>
+            <w:proofErr w:type="gramEnd"/>
+            <w:r>
+              <w:rPr>
+                <w:rFonts w:cs="Times New Roman"/>
+                <w:bCs/>
+                <w:szCs w:val="24"/>
+              </w:rPr>
+              <w:t xml:space="preserve"> the document on evidence</w:t>
             </w:r>
           </w:p>
           <w:p>
@@ -1572,7 +1708,25 @@
                 <w:bCs/>
                 <w:szCs w:val="24"/>
               </w:rPr>
-              <w:t>risks, tools, or implementation details. Mark unsupported information</w:t>
+              <w:t xml:space="preserve">risks, tools, or implementation details. </w:t>
+            </w:r>
+            <w:proofErr w:type="gramStart"/>
+            <w:r>
+              <w:rPr>
+                <w:rFonts w:cs="Times New Roman"/>
+                <w:bCs/>
+                <w:szCs w:val="24"/>
+              </w:rPr>
+              <w:t>Mark</w:t>
+            </w:r>
+            <w:proofErr w:type="gramEnd"/>
+            <w:r>
+              <w:rPr>
+                <w:rFonts w:cs="Times New Roman"/>
+                <w:bCs/>
+                <w:szCs w:val="24"/>
+              </w:rPr>
+              <w:t xml:space="preserve"> unsupported information</w:t>
             </w:r>
           </w:p>
           <w:p>
@@ -1606,7 +1760,7 @@
         </w:tc>
         <w:tc>
           <w:tcPr>
-            <w:tcW w:w="3250" w:type="dxa"/>
+            <w:tcW w:w="3192" w:type="dxa"/>
           </w:tcPr>
           <w:p>
             <w:pPr>
@@ -1631,17 +1785,71 @@
       <w:tr>
         <w:tc>
           <w:tcPr>
-            <w:tcW w:w="2169" w:type="dxa"/>
-          </w:tcPr>
-          <w:p>
-            <w:pPr>
-              <w:spacing w:line="480" w:lineRule="auto"/>
-              <w:rPr>
-                <w:rFonts w:cs="Times New Roman"/>
-                <w:bCs/>
-                <w:szCs w:val="24"/>
-              </w:rPr>
-            </w:pPr>
+            <w:tcW w:w="1970" w:type="dxa"/>
+          </w:tcPr>
+          <w:p>
+            <w:pPr>
+              <w:spacing w:line="480" w:lineRule="auto"/>
+              <w:rPr>
+                <w:rFonts w:cs="Times New Roman"/>
+                <w:bCs/>
+                <w:szCs w:val="24"/>
+              </w:rPr>
+            </w:pPr>
+            <w:r>
+              <w:rPr>
+                <w:rFonts w:cs="Times New Roman"/>
+                <w:bCs/>
+                <w:szCs w:val="24"/>
+              </w:rPr>
+              <w:t>Copilot</w:t>
+            </w:r>
+          </w:p>
+        </w:tc>
+        <w:tc>
+          <w:tcPr>
+            <w:tcW w:w="932" w:type="dxa"/>
+          </w:tcPr>
+          <w:p>
+            <w:pPr>
+              <w:spacing w:line="480" w:lineRule="auto"/>
+              <w:rPr>
+                <w:rFonts w:cs="Times New Roman"/>
+                <w:bCs/>
+                <w:szCs w:val="24"/>
+              </w:rPr>
+            </w:pPr>
+            <w:r>
+              <w:rPr>
+                <w:rFonts w:cs="Times New Roman"/>
+                <w:bCs/>
+                <w:szCs w:val="24"/>
+              </w:rPr>
+              <w:t>8/5</w:t>
+            </w:r>
+          </w:p>
+        </w:tc>
+        <w:tc>
+          <w:tcPr>
+            <w:tcW w:w="3256" w:type="dxa"/>
+          </w:tcPr>
+          <w:p>
+            <w:pPr>
+              <w:spacing w:line="480" w:lineRule="auto"/>
+              <w:rPr>
+                <w:rFonts w:cs="Times New Roman"/>
+                <w:bCs/>
+                <w:szCs w:val="24"/>
+              </w:rPr>
+            </w:pPr>
+            <w:r>
+              <w:rPr>
+                <w:rFonts w:cs="Times New Roman"/>
+                <w:bCs/>
+                <w:szCs w:val="24"/>
+              </w:rPr>
+              <w:t xml:space="preserve">Based on the requriments in PRD.md. Build a file callsed documents/requirements.txt. This document should accuretly reflect the </w:t>
+            </w:r>
             <w:r>
               <w:rPr>
                 <w:rFonts w:cs="Times New Roman"/>
@@ -1649,103 +1857,76 @@
                 <w:szCs w:val="24"/>
               </w:rPr>
               <w:lastRenderedPageBreak/>
-              <w:t>Copilot</w:t>
-            </w:r>
-          </w:p>
-        </w:tc>
-        <w:tc>
-          <w:tcPr>
-            <w:tcW w:w="982" w:type="dxa"/>
-          </w:tcPr>
-          <w:p>
-            <w:pPr>
-              <w:spacing w:line="480" w:lineRule="auto"/>
-              <w:rPr>
-                <w:rFonts w:cs="Times New Roman"/>
-                <w:bCs/>
-                <w:szCs w:val="24"/>
-              </w:rPr>
-            </w:pPr>
-            <w:r>
-              <w:rPr>
-                <w:rFonts w:cs="Times New Roman"/>
-                <w:bCs/>
-                <w:szCs w:val="24"/>
-              </w:rPr>
-              <w:t>8/5</w:t>
-            </w:r>
-          </w:p>
-        </w:tc>
-        <w:tc>
-          <w:tcPr>
-            <w:tcW w:w="2949" w:type="dxa"/>
-          </w:tcPr>
-          <w:p>
-            <w:pPr>
-              <w:spacing w:line="480" w:lineRule="auto"/>
-              <w:rPr>
-                <w:rFonts w:cs="Times New Roman"/>
-                <w:bCs/>
-                <w:szCs w:val="24"/>
-              </w:rPr>
-            </w:pPr>
-            <w:r>
-              <w:rPr>
-                <w:rFonts w:cs="Times New Roman"/>
-                <w:bCs/>
-                <w:szCs w:val="24"/>
-              </w:rPr>
-              <w:t>Based on the requriments in PRD.md. Build a file callsed documents/requirements.txt. This document should accuretly reflect the requirments lead out in PRD.md including Undesirable Events, Risk Analysis, Risk Prioritization, Risk Mitigation, Functional Requirements, Quality Requirements, Performance Requirements, and Requirements Traceability Matrix.</w:t>
-            </w:r>
-          </w:p>
-          <w:p>
-            <w:pPr>
-              <w:spacing w:line="480" w:lineRule="auto"/>
-              <w:rPr>
-                <w:rFonts w:cs="Times New Roman"/>
-                <w:bCs/>
-                <w:szCs w:val="24"/>
-              </w:rPr>
-            </w:pPr>
-            <w:r>
-              <w:rPr>
-                <w:rFonts w:cs="Times New Roman"/>
-                <w:bCs/>
-                <w:szCs w:val="24"/>
-              </w:rPr>
-              <w:t>Do not invent requrimetns that are not listed in PRD.md. Do not create any files other then documents/requirements.txt.</w:t>
-            </w:r>
-          </w:p>
-          <w:p>
-            <w:pPr>
-              <w:spacing w:line="480" w:lineRule="auto"/>
-              <w:rPr>
-                <w:rFonts w:cs="Times New Roman"/>
-                <w:bCs/>
-                <w:szCs w:val="24"/>
-              </w:rPr>
-            </w:pPr>
-          </w:p>
-        </w:tc>
-        <w:tc>
-          <w:tcPr>
-            <w:tcW w:w="3250" w:type="dxa"/>
-          </w:tcPr>
-          <w:p>
-            <w:pPr>
-              <w:spacing w:line="480" w:lineRule="auto"/>
-              <w:rPr>
-                <w:rFonts w:cs="Times New Roman"/>
-                <w:bCs/>
-                <w:szCs w:val="24"/>
-              </w:rPr>
-            </w:pPr>
-            <w:r>
-              <w:rPr>
-                <w:rFonts w:cs="Times New Roman"/>
-                <w:bCs/>
-                <w:szCs w:val="24"/>
-              </w:rPr>
+              <w:t>requirments lead out in PRD.md including Undesirable Events, Risk Analysis, Risk Prioritization, Risk Mitigation, Functional Requirements, Quality Requirements, Performance Requirements, and Requirements Traceability Matrix.</w:t>
+            </w:r>
+          </w:p>
+          <w:p>
+            <w:pPr>
+              <w:spacing w:line="480" w:lineRule="auto"/>
+              <w:rPr>
+                <w:rFonts w:cs="Times New Roman"/>
+                <w:bCs/>
+                <w:szCs w:val="24"/>
+              </w:rPr>
+            </w:pPr>
+            <w:r>
+              <w:rPr>
+                <w:rFonts w:cs="Times New Roman"/>
+                <w:bCs/>
+                <w:szCs w:val="24"/>
+              </w:rPr>
+              <w:t xml:space="preserve">Do not invent requrimetns that are not listed in PRD.md. Do not create any files other </w:t>
+            </w:r>
+            <w:proofErr w:type="gramStart"/>
+            <w:r>
+              <w:rPr>
+                <w:rFonts w:cs="Times New Roman"/>
+                <w:bCs/>
+                <w:szCs w:val="24"/>
+              </w:rPr>
+              <w:t>then</w:t>
+            </w:r>
+            <w:proofErr w:type="gramEnd"/>
+            <w:r>
+              <w:rPr>
+                <w:rFonts w:cs="Times New Roman"/>
+                <w:bCs/>
+                <w:szCs w:val="24"/>
+              </w:rPr>
+              <w:t xml:space="preserve"> documents/requirements.txt.</w:t>
+            </w:r>
+          </w:p>
+          <w:p>
+            <w:pPr>
+              <w:spacing w:line="480" w:lineRule="auto"/>
+              <w:rPr>
+                <w:rFonts w:cs="Times New Roman"/>
+                <w:bCs/>
+                <w:szCs w:val="24"/>
+              </w:rPr>
+            </w:pPr>
+          </w:p>
+        </w:tc>
+        <w:tc>
+          <w:tcPr>
+            <w:tcW w:w="3192" w:type="dxa"/>
+          </w:tcPr>
+          <w:p>
+            <w:pPr>
+              <w:spacing w:line="480" w:lineRule="auto"/>
+              <w:rPr>
+                <w:rFonts w:cs="Times New Roman"/>
+                <w:bCs/>
+                <w:szCs w:val="24"/>
+              </w:rPr>
+            </w:pPr>
+            <w:r>
+              <w:rPr>
+                <w:rFonts w:cs="Times New Roman"/>
+                <w:bCs/>
+                <w:szCs w:val="24"/>
+              </w:rPr>
+              <w:lastRenderedPageBreak/>
               <w:t xml:space="preserve">I used this to create the file </w:t>
             </w:r>
             <w:r>
@@ -1770,8 +1951,136 @@
       <w:tr>
         <w:tc>
           <w:tcPr>
-            <w:tcW w:w="2169" w:type="dxa"/>
-          </w:tcPr>
+            <w:tcW w:w="1970" w:type="dxa"/>
+          </w:tcPr>
+          <w:p>
+            <w:pPr>
+              <w:spacing w:line="480" w:lineRule="auto"/>
+              <w:rPr>
+                <w:rFonts w:cs="Times New Roman"/>
+                <w:bCs/>
+                <w:szCs w:val="24"/>
+              </w:rPr>
+            </w:pPr>
+            <w:r>
+              <w:rPr>
+                <w:rFonts w:cs="Times New Roman"/>
+                <w:bCs/>
+                <w:szCs w:val="24"/>
+              </w:rPr>
+              <w:t>Copilot</w:t>
+            </w:r>
+          </w:p>
+        </w:tc>
+        <w:tc>
+          <w:tcPr>
+            <w:tcW w:w="932" w:type="dxa"/>
+          </w:tcPr>
+          <w:p>
+            <w:pPr>
+              <w:spacing w:line="480" w:lineRule="auto"/>
+              <w:rPr>
+                <w:rFonts w:cs="Times New Roman"/>
+                <w:bCs/>
+                <w:szCs w:val="24"/>
+              </w:rPr>
+            </w:pPr>
+            <w:r>
+              <w:rPr>
+                <w:rFonts w:cs="Times New Roman"/>
+                <w:bCs/>
+                <w:szCs w:val="24"/>
+              </w:rPr>
+              <w:t>8/5</w:t>
+            </w:r>
+          </w:p>
+        </w:tc>
+        <w:tc>
+          <w:tcPr>
+            <w:tcW w:w="3256" w:type="dxa"/>
+          </w:tcPr>
+          <w:p>
+            <w:pPr>
+              <w:spacing w:line="480" w:lineRule="auto"/>
+              <w:rPr>
+                <w:rFonts w:cs="Times New Roman"/>
+                <w:bCs/>
+                <w:szCs w:val="24"/>
+              </w:rPr>
+            </w:pPr>
+            <w:r>
+              <w:rPr>
+                <w:rFonts w:cs="Times New Roman"/>
+                <w:bCs/>
+                <w:szCs w:val="24"/>
+              </w:rPr>
+              <w:t>generate-Software-Test-Plan-and-Report</w:t>
+            </w:r>
+          </w:p>
+          <w:p>
+            <w:pPr>
+              <w:spacing w:line="480" w:lineRule="auto"/>
+              <w:rPr>
+                <w:rFonts w:cs="Times New Roman"/>
+                <w:bCs/>
+                <w:szCs w:val="24"/>
+              </w:rPr>
+            </w:pPr>
+          </w:p>
+          <w:p>
+            <w:pPr>
+              <w:spacing w:line="480" w:lineRule="auto"/>
+              <w:rPr>
+                <w:rFonts w:cs="Times New Roman"/>
+                <w:bCs/>
+                <w:szCs w:val="24"/>
+              </w:rPr>
+            </w:pPr>
+            <w:r>
+              <w:rPr>
+                <w:rFonts w:cs="Times New Roman"/>
+                <w:bCs/>
+                <w:szCs w:val="24"/>
+              </w:rPr>
+              <w:t>Analyze the complete repository using #codebase. Create or update</w:t>
+            </w:r>
+          </w:p>
+          <w:p>
+            <w:pPr>
+              <w:spacing w:line="480" w:lineRule="auto"/>
+              <w:rPr>
+                <w:rFonts w:cs="Times New Roman"/>
+                <w:bCs/>
+                <w:szCs w:val="24"/>
+              </w:rPr>
+            </w:pPr>
+            <w:r>
+              <w:rPr>
+                <w:rFonts w:cs="Times New Roman"/>
+                <w:bCs/>
+                <w:szCs w:val="24"/>
+              </w:rPr>
+              <w:t xml:space="preserve">/documents/Software-Test-Plan-and-Report.md. </w:t>
+            </w:r>
+            <w:proofErr w:type="gramStart"/>
+            <w:r>
+              <w:rPr>
+                <w:rFonts w:cs="Times New Roman"/>
+                <w:bCs/>
+                <w:szCs w:val="24"/>
+              </w:rPr>
+              <w:t>Base</w:t>
+            </w:r>
+            <w:proofErr w:type="gramEnd"/>
+            <w:r>
+              <w:rPr>
+                <w:rFonts w:cs="Times New Roman"/>
+                <w:bCs/>
+                <w:szCs w:val="24"/>
+              </w:rPr>
+              <w:t xml:space="preserve"> the document on evidence</w:t>
+            </w:r>
+          </w:p>
           <w:p>
             <w:pPr>
               <w:spacing w:line="480" w:lineRule="auto"/>
@@ -1788,13 +2097,124 @@
                 <w:szCs w:val="24"/>
               </w:rPr>
               <w:lastRenderedPageBreak/>
+              <w:t>from the repository. Do not invent features, requirements, test results,</w:t>
+            </w:r>
+          </w:p>
+          <w:p>
+            <w:pPr>
+              <w:spacing w:line="480" w:lineRule="auto"/>
+              <w:rPr>
+                <w:rFonts w:cs="Times New Roman"/>
+                <w:bCs/>
+                <w:szCs w:val="24"/>
+              </w:rPr>
+            </w:pPr>
+            <w:r>
+              <w:rPr>
+                <w:rFonts w:cs="Times New Roman"/>
+                <w:bCs/>
+                <w:szCs w:val="24"/>
+              </w:rPr>
+              <w:t xml:space="preserve">risks, tools, or implementation details. </w:t>
+            </w:r>
+            <w:proofErr w:type="gramStart"/>
+            <w:r>
+              <w:rPr>
+                <w:rFonts w:cs="Times New Roman"/>
+                <w:bCs/>
+                <w:szCs w:val="24"/>
+              </w:rPr>
+              <w:t>Mark</w:t>
+            </w:r>
+            <w:proofErr w:type="gramEnd"/>
+            <w:r>
+              <w:rPr>
+                <w:rFonts w:cs="Times New Roman"/>
+                <w:bCs/>
+                <w:szCs w:val="24"/>
+              </w:rPr>
+              <w:t xml:space="preserve"> unsupported information</w:t>
+            </w:r>
+          </w:p>
+          <w:p>
+            <w:pPr>
+              <w:spacing w:line="480" w:lineRule="auto"/>
+              <w:rPr>
+                <w:rFonts w:cs="Times New Roman"/>
+                <w:bCs/>
+                <w:szCs w:val="24"/>
+              </w:rPr>
+            </w:pPr>
+            <w:r>
+              <w:rPr>
+                <w:rFonts w:cs="Times New Roman"/>
+                <w:bCs/>
+                <w:szCs w:val="24"/>
+              </w:rPr>
+              <w:t>as To Be Completed.</w:t>
+            </w:r>
+          </w:p>
+        </w:tc>
+        <w:tc>
+          <w:tcPr>
+            <w:tcW w:w="3192" w:type="dxa"/>
+          </w:tcPr>
+          <w:p>
+            <w:pPr>
+              <w:spacing w:line="480" w:lineRule="auto"/>
+              <w:rPr>
+                <w:rFonts w:cs="Times New Roman"/>
+                <w:bCs/>
+                <w:szCs w:val="24"/>
+              </w:rPr>
+            </w:pPr>
+            <w:r>
+              <w:rPr>
+                <w:rFonts w:cs="Times New Roman"/>
+                <w:bCs/>
+                <w:szCs w:val="24"/>
+              </w:rPr>
+              <w:lastRenderedPageBreak/>
+              <w:t xml:space="preserve">I used this to update </w:t>
+            </w:r>
+            <w:r>
+              <w:rPr>
+                <w:rFonts w:cs="Times New Roman"/>
+                <w:bCs/>
+                <w:szCs w:val="24"/>
+              </w:rPr>
+              <w:t>Software-Test-Plan-and-Report.md</w:t>
+            </w:r>
+          </w:p>
+        </w:tc>
+      </w:tr>
+      <w:tr>
+        <w:tc>
+          <w:tcPr>
+            <w:tcW w:w="1970" w:type="dxa"/>
+          </w:tcPr>
+          <w:p>
+            <w:pPr>
+              <w:spacing w:line="480" w:lineRule="auto"/>
+              <w:rPr>
+                <w:rFonts w:cs="Times New Roman"/>
+                <w:bCs/>
+                <w:szCs w:val="24"/>
+              </w:rPr>
+            </w:pPr>
+            <w:r>
+              <w:rPr>
+                <w:rFonts w:cs="Times New Roman"/>
+                <w:bCs/>
+                <w:szCs w:val="24"/>
+              </w:rPr>
               <w:t>Copilot</w:t>
             </w:r>
           </w:p>
         </w:tc>
         <w:tc>
           <w:tcPr>
-            <w:tcW w:w="982" w:type="dxa"/>
+            <w:tcW w:w="932" w:type="dxa"/>
           </w:tcPr>
           <w:p>
             <w:pPr>
@@ -1817,155 +2237,1127 @@
         </w:tc>
         <w:tc>
           <w:tcPr>
-            <w:tcW w:w="2949" w:type="dxa"/>
-          </w:tcPr>
-          <w:p>
-            <w:pPr>
-              <w:spacing w:line="480" w:lineRule="auto"/>
-              <w:rPr>
-                <w:rFonts w:cs="Times New Roman"/>
-                <w:bCs/>
-                <w:szCs w:val="24"/>
-              </w:rPr>
-            </w:pPr>
-            <w:r>
-              <w:rPr>
-                <w:rFonts w:cs="Times New Roman"/>
-                <w:bCs/>
-                <w:szCs w:val="24"/>
-              </w:rPr>
-              <w:t>generate-Software-Test-Plan-and-Report</w:t>
-            </w:r>
-          </w:p>
-          <w:p>
-            <w:pPr>
-              <w:spacing w:line="480" w:lineRule="auto"/>
-              <w:rPr>
-                <w:rFonts w:cs="Times New Roman"/>
-                <w:bCs/>
-                <w:szCs w:val="24"/>
-              </w:rPr>
-            </w:pPr>
-          </w:p>
-          <w:p>
-            <w:pPr>
-              <w:spacing w:line="480" w:lineRule="auto"/>
-              <w:rPr>
-                <w:rFonts w:cs="Times New Roman"/>
-                <w:bCs/>
-                <w:szCs w:val="24"/>
-              </w:rPr>
-            </w:pPr>
-            <w:r>
-              <w:rPr>
-                <w:rFonts w:cs="Times New Roman"/>
-                <w:bCs/>
-                <w:szCs w:val="24"/>
-              </w:rPr>
-              <w:t>Analyze the complete repository using #codebase. Create or update</w:t>
-            </w:r>
-          </w:p>
-          <w:p>
-            <w:pPr>
-              <w:spacing w:line="480" w:lineRule="auto"/>
-              <w:rPr>
-                <w:rFonts w:cs="Times New Roman"/>
-                <w:bCs/>
-                <w:szCs w:val="24"/>
-              </w:rPr>
-            </w:pPr>
-            <w:r>
-              <w:rPr>
-                <w:rFonts w:cs="Times New Roman"/>
-                <w:bCs/>
-                <w:szCs w:val="24"/>
-              </w:rPr>
-              <w:t>/documents/Software-Test-Plan-and-Report.md. Base the document on evidence</w:t>
-            </w:r>
-          </w:p>
-          <w:p>
-            <w:pPr>
-              <w:spacing w:line="480" w:lineRule="auto"/>
-              <w:rPr>
-                <w:rFonts w:cs="Times New Roman"/>
-                <w:bCs/>
-                <w:szCs w:val="24"/>
-              </w:rPr>
-            </w:pPr>
-            <w:r>
-              <w:rPr>
-                <w:rFonts w:cs="Times New Roman"/>
-                <w:bCs/>
-                <w:szCs w:val="24"/>
-              </w:rPr>
-              <w:t>from the repository. Do not invent features, requirements, test results,</w:t>
-            </w:r>
-          </w:p>
-          <w:p>
-            <w:pPr>
-              <w:spacing w:line="480" w:lineRule="auto"/>
-              <w:rPr>
-                <w:rFonts w:cs="Times New Roman"/>
-                <w:bCs/>
-                <w:szCs w:val="24"/>
-              </w:rPr>
-            </w:pPr>
-            <w:r>
-              <w:rPr>
-                <w:rFonts w:cs="Times New Roman"/>
-                <w:bCs/>
-                <w:szCs w:val="24"/>
-              </w:rPr>
-              <w:t>risks, tools, or implementation details. Mark unsupported information</w:t>
-            </w:r>
-          </w:p>
-          <w:p>
-            <w:pPr>
-              <w:spacing w:line="480" w:lineRule="auto"/>
-              <w:rPr>
-                <w:rFonts w:cs="Times New Roman"/>
-                <w:bCs/>
-                <w:szCs w:val="24"/>
-              </w:rPr>
-            </w:pPr>
-            <w:r>
-              <w:rPr>
-                <w:rFonts w:cs="Times New Roman"/>
-                <w:bCs/>
-                <w:szCs w:val="24"/>
-              </w:rPr>
-              <w:t>as To Be Completed.</w:t>
-            </w:r>
-          </w:p>
-        </w:tc>
-        <w:tc>
-          <w:tcPr>
-            <w:tcW w:w="3250" w:type="dxa"/>
-          </w:tcPr>
-          <w:p>
-            <w:pPr>
-              <w:spacing w:line="480" w:lineRule="auto"/>
-              <w:rPr>
-                <w:rFonts w:cs="Times New Roman"/>
-                <w:bCs/>
-                <w:szCs w:val="24"/>
-              </w:rPr>
-            </w:pPr>
-            <w:r>
-              <w:rPr>
-                <w:rFonts w:cs="Times New Roman"/>
-                <w:bCs/>
-                <w:szCs w:val="24"/>
-              </w:rPr>
-              <w:t xml:space="preserve">I used this to update </w:t>
-            </w:r>
-            <w:r>
-              <w:rPr>
-                <w:rFonts w:cs="Times New Roman"/>
-                <w:bCs/>
-                <w:szCs w:val="24"/>
-              </w:rPr>
-              <w:t>Software-Test-Plan-and-Report.md</w:t>
+            <w:tcW w:w="3256" w:type="dxa"/>
+          </w:tcPr>
+          <w:p>
+            <w:pPr>
+              <w:spacing w:line="480" w:lineRule="auto"/>
+              <w:rPr>
+                <w:rFonts w:cs="Times New Roman"/>
+                <w:bCs/>
+                <w:szCs w:val="24"/>
+              </w:rPr>
+            </w:pPr>
+            <w:r>
+              <w:rPr>
+                <w:rFonts w:cs="Times New Roman"/>
+                <w:bCs/>
+                <w:szCs w:val="24"/>
+              </w:rPr>
+              <w:t>Analize #</w:t>
+            </w:r>
+            <w:proofErr w:type="gramStart"/>
+            <w:r>
+              <w:rPr>
+                <w:rFonts w:cs="Times New Roman"/>
+                <w:bCs/>
+                <w:szCs w:val="24"/>
+              </w:rPr>
+              <w:t>sym:get</w:t>
+            </w:r>
+            <w:proofErr w:type="gramEnd"/>
+            <w:r>
+              <w:rPr>
+                <w:rFonts w:cs="Times New Roman"/>
+                <w:bCs/>
+                <w:szCs w:val="24"/>
+              </w:rPr>
+              <w:t>_map_list and suggest ways to improve runtime efficency. Do not change the code in any way. Do not look at other functions.</w:t>
+            </w:r>
+          </w:p>
+        </w:tc>
+        <w:tc>
+          <w:tcPr>
+            <w:tcW w:w="3192" w:type="dxa"/>
+          </w:tcPr>
+          <w:p>
+            <w:pPr>
+              <w:spacing w:line="480" w:lineRule="auto"/>
+              <w:rPr>
+                <w:rFonts w:cs="Times New Roman"/>
+                <w:bCs/>
+                <w:szCs w:val="24"/>
+              </w:rPr>
+            </w:pPr>
+            <w:r>
+              <w:rPr>
+                <w:rFonts w:cs="Times New Roman"/>
+                <w:bCs/>
+                <w:szCs w:val="24"/>
+              </w:rPr>
+              <w:t>I used this to optimize get_map_list</w:t>
+            </w:r>
+            <w:r>
+              <w:rPr>
+                <w:rFonts w:cs="Times New Roman"/>
+                <w:bCs/>
+                <w:szCs w:val="24"/>
+              </w:rPr>
+              <w:t>,</w:t>
+            </w:r>
+            <w:r>
+              <w:rPr>
+                <w:rFonts w:cs="Times New Roman"/>
+                <w:bCs/>
+                <w:szCs w:val="24"/>
+              </w:rPr>
+              <w:t xml:space="preserve"> as it was currently the </w:t>
+            </w:r>
+            <w:r>
+              <w:rPr>
+                <w:rFonts w:cs="Times New Roman"/>
+                <w:bCs/>
+                <w:szCs w:val="24"/>
+              </w:rPr>
+              <w:t>highest</w:t>
+            </w:r>
+            <w:r>
+              <w:rPr>
+                <w:rFonts w:cs="Times New Roman"/>
+                <w:bCs/>
+                <w:szCs w:val="24"/>
+              </w:rPr>
+              <w:t xml:space="preserve"> cost per call</w:t>
+            </w:r>
+          </w:p>
+        </w:tc>
+      </w:tr>
+      <w:tr>
+        <w:tc>
+          <w:tcPr>
+            <w:tcW w:w="1970" w:type="dxa"/>
+          </w:tcPr>
+          <w:p>
+            <w:pPr>
+              <w:spacing w:line="480" w:lineRule="auto"/>
+              <w:rPr>
+                <w:rFonts w:cs="Times New Roman"/>
+                <w:bCs/>
+                <w:szCs w:val="24"/>
+              </w:rPr>
+            </w:pPr>
+            <w:r>
+              <w:rPr>
+                <w:rFonts w:cs="Times New Roman"/>
+                <w:bCs/>
+                <w:szCs w:val="24"/>
+              </w:rPr>
+              <w:t>Copilot</w:t>
+            </w:r>
+          </w:p>
+        </w:tc>
+        <w:tc>
+          <w:tcPr>
+            <w:tcW w:w="932" w:type="dxa"/>
+          </w:tcPr>
+          <w:p>
+            <w:pPr>
+              <w:spacing w:line="480" w:lineRule="auto"/>
+              <w:rPr>
+                <w:rFonts w:cs="Times New Roman"/>
+                <w:bCs/>
+                <w:szCs w:val="24"/>
+              </w:rPr>
+            </w:pPr>
+            <w:r>
+              <w:rPr>
+                <w:rFonts w:cs="Times New Roman"/>
+                <w:bCs/>
+                <w:szCs w:val="24"/>
+              </w:rPr>
+              <w:t>8/5</w:t>
+            </w:r>
+          </w:p>
+        </w:tc>
+        <w:tc>
+          <w:tcPr>
+            <w:tcW w:w="3256" w:type="dxa"/>
+          </w:tcPr>
+          <w:p>
+            <w:pPr>
+              <w:spacing w:line="480" w:lineRule="auto"/>
+              <w:rPr>
+                <w:rFonts w:cs="Times New Roman"/>
+                <w:bCs/>
+                <w:szCs w:val="24"/>
+              </w:rPr>
+            </w:pPr>
+            <w:r>
+              <w:rPr>
+                <w:rFonts w:cs="Times New Roman"/>
+                <w:bCs/>
+                <w:szCs w:val="24"/>
+              </w:rPr>
+              <w:t>analize #</w:t>
+            </w:r>
+            <w:proofErr w:type="gramStart"/>
+            <w:r>
+              <w:rPr>
+                <w:rFonts w:cs="Times New Roman"/>
+                <w:bCs/>
+                <w:szCs w:val="24"/>
+              </w:rPr>
+              <w:t>sym:search</w:t>
+            </w:r>
+            <w:proofErr w:type="gramEnd"/>
+            <w:r>
+              <w:rPr>
+                <w:rFonts w:cs="Times New Roman"/>
+                <w:bCs/>
+                <w:szCs w:val="24"/>
+              </w:rPr>
+              <w:t xml:space="preserve"> and </w:t>
+            </w:r>
+            <w:proofErr w:type="gramStart"/>
+            <w:r>
+              <w:rPr>
+                <w:rFonts w:cs="Times New Roman"/>
+                <w:bCs/>
+                <w:szCs w:val="24"/>
+              </w:rPr>
+              <w:t>it's</w:t>
+            </w:r>
+            <w:proofErr w:type="gramEnd"/>
+            <w:r>
+              <w:rPr>
+                <w:rFonts w:cs="Times New Roman"/>
+                <w:bCs/>
+                <w:szCs w:val="24"/>
+              </w:rPr>
+              <w:t xml:space="preserve"> subfuctions. suggest ways to improve runtime efficency without changing the inputs to the main search fucntions. Do not change the code in any way during this promt.</w:t>
+            </w:r>
+          </w:p>
+        </w:tc>
+        <w:tc>
+          <w:tcPr>
+            <w:tcW w:w="3192" w:type="dxa"/>
+          </w:tcPr>
+          <w:p>
+            <w:pPr>
+              <w:spacing w:line="480" w:lineRule="auto"/>
+              <w:rPr>
+                <w:rFonts w:cs="Times New Roman"/>
+                <w:bCs/>
+                <w:szCs w:val="24"/>
+              </w:rPr>
+            </w:pPr>
+            <w:r>
+              <w:rPr>
+                <w:rFonts w:cs="Times New Roman"/>
+                <w:bCs/>
+                <w:szCs w:val="24"/>
+              </w:rPr>
+              <w:t>I used this optimize my search function as it was the biggest overhead currently in the program.</w:t>
+            </w:r>
+          </w:p>
+        </w:tc>
+      </w:tr>
+      <w:tr>
+        <w:tc>
+          <w:tcPr>
+            <w:tcW w:w="1970" w:type="dxa"/>
+          </w:tcPr>
+          <w:p>
+            <w:pPr>
+              <w:spacing w:line="480" w:lineRule="auto"/>
+              <w:rPr>
+                <w:rFonts w:cs="Times New Roman"/>
+                <w:bCs/>
+                <w:szCs w:val="24"/>
+              </w:rPr>
+            </w:pPr>
+            <w:r>
+              <w:rPr>
+                <w:rFonts w:cs="Times New Roman"/>
+                <w:bCs/>
+                <w:szCs w:val="24"/>
+              </w:rPr>
+              <w:t>Copilot</w:t>
+            </w:r>
+          </w:p>
+        </w:tc>
+        <w:tc>
+          <w:tcPr>
+            <w:tcW w:w="932" w:type="dxa"/>
+          </w:tcPr>
+          <w:p>
+            <w:pPr>
+              <w:spacing w:line="480" w:lineRule="auto"/>
+              <w:rPr>
+                <w:rFonts w:cs="Times New Roman"/>
+                <w:bCs/>
+                <w:szCs w:val="24"/>
+              </w:rPr>
+            </w:pPr>
+            <w:r>
+              <w:rPr>
+                <w:rFonts w:cs="Times New Roman"/>
+                <w:bCs/>
+                <w:szCs w:val="24"/>
+              </w:rPr>
+              <w:t>8/5</w:t>
+            </w:r>
+          </w:p>
+        </w:tc>
+        <w:tc>
+          <w:tcPr>
+            <w:tcW w:w="3256" w:type="dxa"/>
+          </w:tcPr>
+          <w:p>
+            <w:pPr>
+              <w:spacing w:line="480" w:lineRule="auto"/>
+              <w:rPr>
+                <w:rFonts w:cs="Times New Roman"/>
+                <w:bCs/>
+                <w:szCs w:val="24"/>
+              </w:rPr>
+            </w:pPr>
+            <w:r>
+              <w:rPr>
+                <w:rFonts w:cs="Times New Roman"/>
+                <w:bCs/>
+                <w:szCs w:val="24"/>
+              </w:rPr>
+              <w:t>analyze #</w:t>
+            </w:r>
+            <w:proofErr w:type="gramStart"/>
+            <w:r>
+              <w:rPr>
+                <w:rFonts w:cs="Times New Roman"/>
+                <w:bCs/>
+                <w:szCs w:val="24"/>
+              </w:rPr>
+              <w:t>sym:_</w:t>
+            </w:r>
+            <w:proofErr w:type="gramEnd"/>
+            <w:r>
+              <w:rPr>
+                <w:rFonts w:cs="Times New Roman"/>
+                <w:bCs/>
+                <w:szCs w:val="24"/>
+              </w:rPr>
+              <w:t>pursuit_</w:t>
+            </w:r>
+            <w:proofErr w:type="gramStart"/>
+            <w:r>
+              <w:rPr>
+                <w:rFonts w:cs="Times New Roman"/>
+                <w:bCs/>
+                <w:szCs w:val="24"/>
+              </w:rPr>
+              <w:t>weight  and</w:t>
+            </w:r>
+            <w:proofErr w:type="gramEnd"/>
+            <w:r>
+              <w:rPr>
+                <w:rFonts w:cs="Times New Roman"/>
+                <w:bCs/>
+                <w:szCs w:val="24"/>
+              </w:rPr>
+              <w:t xml:space="preserve"> suggest optimizations to runtime efficency. </w:t>
+            </w:r>
+          </w:p>
+          <w:p>
+            <w:pPr>
+              <w:spacing w:line="480" w:lineRule="auto"/>
+              <w:rPr>
+                <w:rFonts w:cs="Times New Roman"/>
+                <w:bCs/>
+                <w:szCs w:val="24"/>
+              </w:rPr>
+            </w:pPr>
+          </w:p>
+          <w:p>
+            <w:pPr>
+              <w:spacing w:line="480" w:lineRule="auto"/>
+              <w:rPr>
+                <w:rFonts w:cs="Times New Roman"/>
+                <w:bCs/>
+                <w:szCs w:val="24"/>
+              </w:rPr>
+            </w:pPr>
+            <w:r>
+              <w:rPr>
+                <w:rFonts w:cs="Times New Roman"/>
+                <w:bCs/>
+                <w:szCs w:val="24"/>
+              </w:rPr>
+              <w:lastRenderedPageBreak/>
+              <w:t>do not change the core funcinality of the code in any way. do not change code in during this promt. do not change the functions inputs.</w:t>
+            </w:r>
+          </w:p>
+        </w:tc>
+        <w:tc>
+          <w:tcPr>
+            <w:tcW w:w="3192" w:type="dxa"/>
+          </w:tcPr>
+          <w:p>
+            <w:pPr>
+              <w:spacing w:line="480" w:lineRule="auto"/>
+              <w:rPr>
+                <w:rFonts w:cs="Times New Roman"/>
+                <w:bCs/>
+                <w:szCs w:val="24"/>
+              </w:rPr>
+            </w:pPr>
+            <w:r>
+              <w:rPr>
+                <w:rFonts w:cs="Times New Roman"/>
+                <w:bCs/>
+                <w:szCs w:val="24"/>
+              </w:rPr>
+              <w:lastRenderedPageBreak/>
+              <w:t>I used this to optimize the _pursuit_weight function for runtime efficiency</w:t>
+            </w:r>
+          </w:p>
+        </w:tc>
+      </w:tr>
+      <w:tr>
+        <w:tc>
+          <w:tcPr>
+            <w:tcW w:w="1970" w:type="dxa"/>
+          </w:tcPr>
+          <w:p>
+            <w:pPr>
+              <w:spacing w:line="480" w:lineRule="auto"/>
+              <w:rPr>
+                <w:rFonts w:cs="Times New Roman"/>
+                <w:bCs/>
+                <w:szCs w:val="24"/>
+              </w:rPr>
+            </w:pPr>
+            <w:r>
+              <w:rPr>
+                <w:rFonts w:cs="Times New Roman"/>
+                <w:bCs/>
+                <w:szCs w:val="24"/>
+              </w:rPr>
+              <w:t>Copilot</w:t>
+            </w:r>
+          </w:p>
+        </w:tc>
+        <w:tc>
+          <w:tcPr>
+            <w:tcW w:w="932" w:type="dxa"/>
+          </w:tcPr>
+          <w:p>
+            <w:pPr>
+              <w:spacing w:line="480" w:lineRule="auto"/>
+              <w:rPr>
+                <w:rFonts w:cs="Times New Roman"/>
+                <w:bCs/>
+                <w:szCs w:val="24"/>
+              </w:rPr>
+            </w:pPr>
+            <w:r>
+              <w:rPr>
+                <w:rFonts w:cs="Times New Roman"/>
+                <w:bCs/>
+                <w:szCs w:val="24"/>
+              </w:rPr>
+              <w:t>8/5</w:t>
+            </w:r>
+          </w:p>
+        </w:tc>
+        <w:tc>
+          <w:tcPr>
+            <w:tcW w:w="3256" w:type="dxa"/>
+          </w:tcPr>
+          <w:p>
+            <w:pPr>
+              <w:spacing w:line="480" w:lineRule="auto"/>
+              <w:rPr>
+                <w:rFonts w:cs="Times New Roman"/>
+                <w:bCs/>
+                <w:szCs w:val="24"/>
+              </w:rPr>
+            </w:pPr>
+            <w:r>
+              <w:rPr>
+                <w:rFonts w:cs="Times New Roman"/>
+                <w:bCs/>
+                <w:szCs w:val="24"/>
+              </w:rPr>
+              <w:t>analyze #</w:t>
+            </w:r>
+            <w:proofErr w:type="gramStart"/>
+            <w:r>
+              <w:rPr>
+                <w:rFonts w:cs="Times New Roman"/>
+                <w:bCs/>
+                <w:szCs w:val="24"/>
+              </w:rPr>
+              <w:t>sym:_</w:t>
+            </w:r>
+            <w:proofErr w:type="gramEnd"/>
+            <w:r>
+              <w:rPr>
+                <w:rFonts w:cs="Times New Roman"/>
+                <w:bCs/>
+                <w:szCs w:val="24"/>
+              </w:rPr>
+              <w:t>get_max_weight and it's subfunctions to suggest optimizations to runtime efficency.</w:t>
+            </w:r>
+          </w:p>
+          <w:p>
+            <w:pPr>
+              <w:spacing w:line="480" w:lineRule="auto"/>
+              <w:rPr>
+                <w:rFonts w:cs="Times New Roman"/>
+                <w:bCs/>
+                <w:szCs w:val="24"/>
+              </w:rPr>
+            </w:pPr>
+          </w:p>
+          <w:p>
+            <w:pPr>
+              <w:spacing w:line="480" w:lineRule="auto"/>
+              <w:rPr>
+                <w:rFonts w:cs="Times New Roman"/>
+                <w:bCs/>
+                <w:szCs w:val="24"/>
+              </w:rPr>
+            </w:pPr>
+            <w:r>
+              <w:rPr>
+                <w:rFonts w:cs="Times New Roman"/>
+                <w:bCs/>
+                <w:szCs w:val="24"/>
+              </w:rPr>
+              <w:t>do not change the core funcinality of the code in any way. do not change code in during this promt. do not change the functions inputs.</w:t>
+            </w:r>
+          </w:p>
+        </w:tc>
+        <w:tc>
+          <w:tcPr>
+            <w:tcW w:w="3192" w:type="dxa"/>
+          </w:tcPr>
+          <w:p>
+            <w:pPr>
+              <w:spacing w:line="480" w:lineRule="auto"/>
+              <w:rPr>
+                <w:rFonts w:cs="Times New Roman"/>
+                <w:bCs/>
+                <w:szCs w:val="24"/>
+              </w:rPr>
+            </w:pPr>
+            <w:r>
+              <w:rPr>
+                <w:rFonts w:cs="Times New Roman"/>
+                <w:bCs/>
+                <w:szCs w:val="24"/>
+              </w:rPr>
+              <w:t xml:space="preserve">I used this to help get ideas on how to optimize </w:t>
+            </w:r>
+            <w:r>
+              <w:rPr>
+                <w:rFonts w:cs="Times New Roman"/>
+                <w:bCs/>
+                <w:szCs w:val="24"/>
+              </w:rPr>
+              <w:t xml:space="preserve">_get_max_weight </w:t>
+            </w:r>
+            <w:r>
+              <w:rPr>
+                <w:rFonts w:cs="Times New Roman"/>
+                <w:bCs/>
+                <w:szCs w:val="24"/>
+              </w:rPr>
+              <w:t>and it’s subfuctions</w:t>
+            </w:r>
+          </w:p>
+        </w:tc>
+      </w:tr>
+      <w:tr>
+        <w:tc>
+          <w:tcPr>
+            <w:tcW w:w="1970" w:type="dxa"/>
+          </w:tcPr>
+          <w:p>
+            <w:pPr>
+              <w:spacing w:line="480" w:lineRule="auto"/>
+              <w:rPr>
+                <w:rFonts w:cs="Times New Roman"/>
+                <w:bCs/>
+                <w:szCs w:val="24"/>
+              </w:rPr>
+            </w:pPr>
+            <w:r>
+              <w:rPr>
+                <w:rFonts w:cs="Times New Roman"/>
+                <w:bCs/>
+                <w:szCs w:val="24"/>
+              </w:rPr>
+              <w:t>Gemini</w:t>
+            </w:r>
+          </w:p>
+        </w:tc>
+        <w:tc>
+          <w:tcPr>
+            <w:tcW w:w="932" w:type="dxa"/>
+          </w:tcPr>
+          <w:p>
+            <w:pPr>
+              <w:spacing w:line="480" w:lineRule="auto"/>
+              <w:rPr>
+                <w:rFonts w:cs="Times New Roman"/>
+                <w:bCs/>
+                <w:szCs w:val="24"/>
+              </w:rPr>
+            </w:pPr>
+            <w:r>
+              <w:rPr>
+                <w:rFonts w:cs="Times New Roman"/>
+                <w:bCs/>
+                <w:szCs w:val="24"/>
+              </w:rPr>
+              <w:t>8/5</w:t>
+            </w:r>
+          </w:p>
+        </w:tc>
+        <w:tc>
+          <w:tcPr>
+            <w:tcW w:w="3256" w:type="dxa"/>
+          </w:tcPr>
+          <w:p>
+            <w:pPr>
+              <w:spacing w:line="480" w:lineRule="auto"/>
+              <w:rPr>
+                <w:rFonts w:cs="Times New Roman"/>
+                <w:bCs/>
+                <w:szCs w:val="24"/>
+              </w:rPr>
+            </w:pPr>
+            <w:r>
+              <w:rPr>
+                <w:rFonts w:cs="Times New Roman"/>
+                <w:bCs/>
+                <w:szCs w:val="24"/>
+              </w:rPr>
+              <w:t xml:space="preserve">Init propt: </w:t>
+            </w:r>
+            <w:r>
+              <w:rPr>
+                <w:rFonts w:cs="Times New Roman"/>
+                <w:bCs/>
+                <w:szCs w:val="24"/>
+              </w:rPr>
+              <w:t>python building a dictionary from a list of sets</w:t>
+            </w:r>
+          </w:p>
+          <w:p>
+            <w:pPr>
+              <w:spacing w:line="480" w:lineRule="auto"/>
+              <w:rPr>
+                <w:rFonts w:cs="Times New Roman"/>
+                <w:bCs/>
+                <w:szCs w:val="24"/>
+              </w:rPr>
+            </w:pPr>
+          </w:p>
+          <w:p>
+            <w:pPr>
+              <w:spacing w:line="480" w:lineRule="auto"/>
+              <w:rPr>
+                <w:rFonts w:cs="Times New Roman"/>
+                <w:bCs/>
+                <w:szCs w:val="24"/>
+              </w:rPr>
+            </w:pPr>
+            <w:r>
+              <w:rPr>
+                <w:rFonts w:cs="Times New Roman"/>
+                <w:bCs/>
+                <w:szCs w:val="24"/>
+              </w:rPr>
+              <w:t xml:space="preserve">Extended: </w:t>
+            </w:r>
+            <w:r>
+              <w:rPr>
+                <w:rFonts w:cs="Times New Roman"/>
+                <w:bCs/>
+                <w:szCs w:val="24"/>
+              </w:rPr>
+              <w:t>The list is in the form of multiple sets that contain tuples that relate to coordinates seen below. [</w:t>
+            </w:r>
+            <w:proofErr w:type="gramStart"/>
+            <w:r>
+              <w:rPr>
+                <w:rFonts w:cs="Times New Roman"/>
+                <w:bCs/>
+                <w:szCs w:val="24"/>
+              </w:rPr>
+              <w:t>set(</w:t>
+            </w:r>
+            <w:proofErr w:type="gramEnd"/>
+            <w:r>
+              <w:rPr>
+                <w:rFonts w:cs="Times New Roman"/>
+                <w:bCs/>
+                <w:szCs w:val="24"/>
+              </w:rPr>
+              <w:t xml:space="preserve">), </w:t>
+            </w:r>
+            <w:proofErr w:type="gramStart"/>
+            <w:r>
+              <w:rPr>
+                <w:rFonts w:cs="Times New Roman"/>
+                <w:bCs/>
+                <w:szCs w:val="24"/>
+              </w:rPr>
+              <w:lastRenderedPageBreak/>
+              <w:t>set(</w:t>
+            </w:r>
+            <w:proofErr w:type="gramEnd"/>
+            <w:r>
+              <w:rPr>
+                <w:rFonts w:cs="Times New Roman"/>
+                <w:bCs/>
+                <w:szCs w:val="24"/>
+              </w:rPr>
+              <w:t xml:space="preserve">), {(46, 30), (44, 30), (45, 29), (45, 31)}, </w:t>
+            </w:r>
+            <w:proofErr w:type="gramStart"/>
+            <w:r>
+              <w:rPr>
+                <w:rFonts w:cs="Times New Roman"/>
+                <w:bCs/>
+                <w:szCs w:val="24"/>
+              </w:rPr>
+              <w:t>set(</w:t>
+            </w:r>
+            <w:proofErr w:type="gramEnd"/>
+            <w:r>
+              <w:rPr>
+                <w:rFonts w:cs="Times New Roman"/>
+                <w:bCs/>
+                <w:szCs w:val="24"/>
+              </w:rPr>
+              <w:t xml:space="preserve">), </w:t>
+            </w:r>
+            <w:proofErr w:type="gramStart"/>
+            <w:r>
+              <w:rPr>
+                <w:rFonts w:cs="Times New Roman"/>
+                <w:bCs/>
+                <w:szCs w:val="24"/>
+              </w:rPr>
+              <w:t>set(</w:t>
+            </w:r>
+            <w:proofErr w:type="gramEnd"/>
+            <w:r>
+              <w:rPr>
+                <w:rFonts w:cs="Times New Roman"/>
+                <w:bCs/>
+                <w:szCs w:val="24"/>
+              </w:rPr>
+              <w:t xml:space="preserve">), </w:t>
+            </w:r>
+            <w:proofErr w:type="gramStart"/>
+            <w:r>
+              <w:rPr>
+                <w:rFonts w:cs="Times New Roman"/>
+                <w:bCs/>
+                <w:szCs w:val="24"/>
+              </w:rPr>
+              <w:t>set(</w:t>
+            </w:r>
+            <w:proofErr w:type="gramEnd"/>
+            <w:r>
+              <w:rPr>
+                <w:rFonts w:cs="Times New Roman"/>
+                <w:bCs/>
+                <w:szCs w:val="24"/>
+              </w:rPr>
+              <w:t xml:space="preserve">), {(45, 30)}, </w:t>
+            </w:r>
+            <w:proofErr w:type="gramStart"/>
+            <w:r>
+              <w:rPr>
+                <w:rFonts w:cs="Times New Roman"/>
+                <w:bCs/>
+                <w:szCs w:val="24"/>
+              </w:rPr>
+              <w:t>set(</w:t>
+            </w:r>
+            <w:proofErr w:type="gramEnd"/>
+            <w:r>
+              <w:rPr>
+                <w:rFonts w:cs="Times New Roman"/>
+                <w:bCs/>
+                <w:szCs w:val="24"/>
+              </w:rPr>
+              <w:t xml:space="preserve">), </w:t>
+            </w:r>
+            <w:proofErr w:type="gramStart"/>
+            <w:r>
+              <w:rPr>
+                <w:rFonts w:cs="Times New Roman"/>
+                <w:bCs/>
+                <w:szCs w:val="24"/>
+              </w:rPr>
+              <w:t>set(</w:t>
+            </w:r>
+            <w:proofErr w:type="gramEnd"/>
+            <w:r>
+              <w:rPr>
+                <w:rFonts w:cs="Times New Roman"/>
+                <w:bCs/>
+                <w:szCs w:val="24"/>
+              </w:rPr>
+              <w:t xml:space="preserve">), </w:t>
+            </w:r>
+            <w:proofErr w:type="gramStart"/>
+            <w:r>
+              <w:rPr>
+                <w:rFonts w:cs="Times New Roman"/>
+                <w:bCs/>
+                <w:szCs w:val="24"/>
+              </w:rPr>
+              <w:t>set(</w:t>
+            </w:r>
+            <w:proofErr w:type="gramEnd"/>
+            <w:r>
+              <w:rPr>
+                <w:rFonts w:cs="Times New Roman"/>
+                <w:bCs/>
+                <w:szCs w:val="24"/>
+              </w:rPr>
+              <w:t xml:space="preserve">), </w:t>
+            </w:r>
+            <w:proofErr w:type="gramStart"/>
+            <w:r>
+              <w:rPr>
+                <w:rFonts w:cs="Times New Roman"/>
+                <w:bCs/>
+                <w:szCs w:val="24"/>
+              </w:rPr>
+              <w:t>set(</w:t>
+            </w:r>
+            <w:proofErr w:type="gramEnd"/>
+            <w:r>
+              <w:rPr>
+                <w:rFonts w:cs="Times New Roman"/>
+                <w:bCs/>
+                <w:szCs w:val="24"/>
+              </w:rPr>
+              <w:t>)] The dictionary should have the key containing the coordinate, and its index + 1 * 5 as it's value</w:t>
+            </w:r>
+          </w:p>
+        </w:tc>
+        <w:tc>
+          <w:tcPr>
+            <w:tcW w:w="3192" w:type="dxa"/>
+          </w:tcPr>
+          <w:p>
+            <w:pPr>
+              <w:spacing w:line="480" w:lineRule="auto"/>
+              <w:rPr>
+                <w:rFonts w:cs="Times New Roman"/>
+                <w:bCs/>
+                <w:szCs w:val="24"/>
+              </w:rPr>
+            </w:pPr>
+            <w:r>
+              <w:rPr>
+                <w:rFonts w:cs="Times New Roman"/>
+                <w:bCs/>
+                <w:szCs w:val="24"/>
+              </w:rPr>
+              <w:lastRenderedPageBreak/>
+              <w:t xml:space="preserve">I used this to help optimize </w:t>
+            </w:r>
+            <w:r>
+              <w:rPr>
+                <w:rFonts w:cs="Times New Roman"/>
+                <w:bCs/>
+                <w:szCs w:val="24"/>
+              </w:rPr>
+              <w:t>_scent_list_lookup_builder</w:t>
+            </w:r>
+          </w:p>
+          <w:p>
+            <w:pPr>
+              <w:spacing w:line="480" w:lineRule="auto"/>
+              <w:rPr>
+                <w:rFonts w:cs="Times New Roman"/>
+                <w:bCs/>
+                <w:szCs w:val="24"/>
+              </w:rPr>
+            </w:pPr>
+          </w:p>
+        </w:tc>
+      </w:tr>
+      <w:tr>
+        <w:tc>
+          <w:tcPr>
+            <w:tcW w:w="1970" w:type="dxa"/>
+          </w:tcPr>
+          <w:p>
+            <w:pPr>
+              <w:spacing w:line="480" w:lineRule="auto"/>
+              <w:rPr>
+                <w:rFonts w:cs="Times New Roman"/>
+                <w:bCs/>
+                <w:szCs w:val="24"/>
+              </w:rPr>
+            </w:pPr>
+            <w:r>
+              <w:rPr>
+                <w:rFonts w:cs="Times New Roman"/>
+                <w:bCs/>
+                <w:szCs w:val="24"/>
+              </w:rPr>
+              <w:t>Copilot</w:t>
+            </w:r>
+          </w:p>
+        </w:tc>
+        <w:tc>
+          <w:tcPr>
+            <w:tcW w:w="932" w:type="dxa"/>
+          </w:tcPr>
+          <w:p>
+            <w:pPr>
+              <w:spacing w:line="480" w:lineRule="auto"/>
+              <w:rPr>
+                <w:rFonts w:cs="Times New Roman"/>
+                <w:bCs/>
+                <w:szCs w:val="24"/>
+              </w:rPr>
+            </w:pPr>
+            <w:r>
+              <w:rPr>
+                <w:rFonts w:cs="Times New Roman"/>
+                <w:bCs/>
+                <w:szCs w:val="24"/>
+              </w:rPr>
+              <w:t>8/5</w:t>
+            </w:r>
+          </w:p>
+        </w:tc>
+        <w:tc>
+          <w:tcPr>
+            <w:tcW w:w="3256" w:type="dxa"/>
+          </w:tcPr>
+          <w:p>
+            <w:pPr>
+              <w:spacing w:line="480" w:lineRule="auto"/>
+              <w:rPr>
+                <w:rFonts w:cs="Times New Roman"/>
+                <w:bCs/>
+                <w:szCs w:val="24"/>
+              </w:rPr>
+            </w:pPr>
+            <w:r>
+              <w:rPr>
+                <w:rFonts w:cs="Times New Roman"/>
+                <w:bCs/>
+                <w:szCs w:val="24"/>
+              </w:rPr>
+              <w:t xml:space="preserve">Init promt: </w:t>
+            </w:r>
+            <w:r>
+              <w:rPr>
+                <w:rFonts w:cs="Times New Roman"/>
+                <w:bCs/>
+                <w:szCs w:val="24"/>
+              </w:rPr>
+              <w:t xml:space="preserve">Read #codebase and check if there is the ability to create a dead lock for the python </w:t>
+            </w:r>
+            <w:proofErr w:type="gramStart"/>
+            <w:r>
+              <w:rPr>
+                <w:rFonts w:cs="Times New Roman"/>
+                <w:bCs/>
+                <w:szCs w:val="24"/>
+              </w:rPr>
+              <w:t>concurrent.futures</w:t>
+            </w:r>
+            <w:proofErr w:type="gramEnd"/>
+            <w:r>
+              <w:rPr>
+                <w:rFonts w:cs="Times New Roman"/>
+                <w:bCs/>
+                <w:szCs w:val="24"/>
+              </w:rPr>
+              <w:t xml:space="preserve"> class.</w:t>
+            </w:r>
+          </w:p>
+          <w:p>
+            <w:pPr>
+              <w:spacing w:line="480" w:lineRule="auto"/>
+              <w:rPr>
+                <w:bCs/>
+              </w:rPr>
+            </w:pPr>
+            <w:r>
+              <w:rPr>
+                <w:rFonts w:cs="Times New Roman"/>
+                <w:bCs/>
+                <w:szCs w:val="24"/>
+              </w:rPr>
+              <w:t>do not change code. Do not make up code that does not exist in the codebase.</w:t>
+            </w:r>
+            <w:r>
+              <w:rPr>
+                <w:rFonts w:cs="Times New Roman"/>
+                <w:bCs/>
+                <w:szCs w:val="24"/>
+              </w:rPr>
+              <w:br/>
+            </w:r>
+            <w:r>
+              <w:rPr>
+                <w:rFonts w:cs="Times New Roman"/>
+                <w:bCs/>
+                <w:szCs w:val="24"/>
+              </w:rPr>
+              <w:br/>
+              <w:t xml:space="preserve">continued prompt: </w:t>
+            </w:r>
+            <w:r>
+              <w:rPr>
+                <w:bCs/>
+              </w:rPr>
+              <w:t>Read #</w:t>
+            </w:r>
+            <w:proofErr w:type="gramStart"/>
+            <w:r>
+              <w:rPr>
+                <w:bCs/>
+              </w:rPr>
+              <w:t>file:simulation-v2.py</w:t>
+            </w:r>
+            <w:proofErr w:type="gramEnd"/>
+            <w:r>
+              <w:rPr>
+                <w:bCs/>
+              </w:rPr>
+              <w:t xml:space="preserve"> and explain how to </w:t>
+            </w:r>
+            <w:r>
+              <w:rPr>
+                <w:bCs/>
+              </w:rPr>
+              <w:t>import</w:t>
+            </w:r>
+            <w:r>
+              <w:rPr>
+                <w:bCs/>
+              </w:rPr>
+              <w:t xml:space="preserve"> the classes from the classes folder without updating </w:t>
+            </w:r>
+            <w:proofErr w:type="gramStart"/>
+            <w:r>
+              <w:rPr>
+                <w:bCs/>
+              </w:rPr>
+              <w:t>sys.path</w:t>
+            </w:r>
+            <w:proofErr w:type="gramEnd"/>
+            <w:r>
+              <w:rPr>
+                <w:bCs/>
+              </w:rPr>
+              <w:t>.</w:t>
+            </w:r>
+          </w:p>
+          <w:p>
+            <w:pPr>
+              <w:spacing w:line="480" w:lineRule="auto"/>
+              <w:rPr>
+                <w:rFonts w:cs="Times New Roman"/>
+                <w:bCs/>
+                <w:szCs w:val="24"/>
+              </w:rPr>
+            </w:pPr>
+            <w:r>
+              <w:rPr>
+                <w:rFonts w:cs="Times New Roman"/>
+                <w:bCs/>
+                <w:szCs w:val="24"/>
+              </w:rPr>
+              <w:lastRenderedPageBreak/>
+              <w:t>Do not change the code directly.</w:t>
+            </w:r>
+            <w:r>
+              <w:rPr>
+                <w:rFonts w:cs="Times New Roman"/>
+                <w:bCs/>
+                <w:szCs w:val="24"/>
+              </w:rPr>
+              <w:br/>
+            </w:r>
+            <w:r>
+              <w:rPr>
+                <w:rFonts w:cs="Times New Roman"/>
+                <w:bCs/>
+                <w:szCs w:val="24"/>
+              </w:rPr>
+              <w:br/>
+              <w:t xml:space="preserve">continued prompt: </w:t>
+            </w:r>
+            <w:r>
+              <w:rPr>
+                <w:rFonts w:cs="Times New Roman"/>
+                <w:bCs/>
+                <w:szCs w:val="24"/>
+              </w:rPr>
+              <w:t>how do you update the imports in /classes</w:t>
+            </w:r>
+          </w:p>
+          <w:p>
+            <w:pPr>
+              <w:spacing w:line="480" w:lineRule="auto"/>
+              <w:rPr>
+                <w:rFonts w:cs="Times New Roman"/>
+                <w:bCs/>
+                <w:szCs w:val="24"/>
+              </w:rPr>
+            </w:pPr>
+          </w:p>
+          <w:p>
+            <w:pPr>
+              <w:spacing w:line="480" w:lineRule="auto"/>
+              <w:rPr>
+                <w:rFonts w:cs="Times New Roman"/>
+                <w:bCs/>
+                <w:szCs w:val="24"/>
+              </w:rPr>
+            </w:pPr>
+          </w:p>
+        </w:tc>
+        <w:tc>
+          <w:tcPr>
+            <w:tcW w:w="3192" w:type="dxa"/>
+          </w:tcPr>
+          <w:p>
+            <w:pPr>
+              <w:spacing w:line="480" w:lineRule="auto"/>
+              <w:rPr>
+                <w:rFonts w:cs="Times New Roman"/>
+                <w:bCs/>
+                <w:szCs w:val="24"/>
+              </w:rPr>
+            </w:pPr>
+            <w:r>
+              <w:rPr>
+                <w:rFonts w:cs="Times New Roman"/>
+                <w:bCs/>
+                <w:szCs w:val="24"/>
+              </w:rPr>
+              <w:lastRenderedPageBreak/>
+              <w:t>I ran into an issue where python was still running but was in a holding pattern. After some research I found that it could be a dead lock. Then after analysis I believed it was due to how I was importing my modules. I had to change it, no longer updating the system path to allow the modules to be imported.</w:t>
             </w:r>
           </w:p>
         </w:tc>
@@ -2758,7 +4150,6 @@
   <w:style w:type="character" w:default="1" w:styleId="DefaultParagraphFont">
     <w:name w:val="Default Paragraph Font"/>
     <w:uiPriority w:val="1"/>
-    <w:semiHidden/>
     <w:unhideWhenUsed/>
   </w:style>
   <w:style w:type="table" w:default="1" w:styleId="TableNormal">
@@ -3166,6 +4557,18 @@
       <w:shd w:val="clear" w:color="auto" w:fill="E1DFDD"/>
     </w:rPr>
   </w:style>
+  <w:style w:type="paragraph" w:styleId="NormalWeb">
+    <w:name w:val="Normal (Web)"/>
+    <w:basedOn w:val="Normal"/>
+    <w:uiPriority w:val="99"/>
+    <w:semiHidden/>
+    <w:unhideWhenUsed/>
+    <w:rsid w:val="00E26F5E"/>
+    <w:rPr>
+      <w:rFonts w:cs="Times New Roman"/>
+      <w:szCs w:val="24"/>
+    </w:rPr>
+  </w:style>
 </w:styles>
 </file>
 

</xml_diff>